<commit_message>
Rutas de los datos del vendedor
</commit_message>
<xml_diff>
--- a/plantilla.docx
+++ b/plantilla.docx
@@ -1230,21 +1230,12 @@
         <w:t>{{</w:t>
       </w:r>
       <w:proofErr w:type="spellStart"/>
-      <w:proofErr w:type="gramStart"/>
-      <w:r>
-        <w:rPr>
-          <w:sz w:val="22"/>
-          <w:szCs w:val="22"/>
-        </w:rPr>
-        <w:t>inmueble.medidas</w:t>
-      </w:r>
-      <w:proofErr w:type="gramEnd"/>
-      <w:r>
-        <w:rPr>
-          <w:sz w:val="22"/>
-          <w:szCs w:val="22"/>
-        </w:rPr>
-        <w:t>_colindancias</w:t>
+      <w:r>
+        <w:rPr>
+          <w:sz w:val="22"/>
+          <w:szCs w:val="22"/>
+        </w:rPr>
+        <w:t>inmueble.medidas_colindancias</w:t>
       </w:r>
       <w:proofErr w:type="spellEnd"/>
       <w:r>
@@ -1362,7 +1353,6 @@
         <w:t>{{</w:t>
       </w:r>
       <w:proofErr w:type="spellStart"/>
-      <w:proofErr w:type="gramStart"/>
       <w:r>
         <w:rPr>
           <w:sz w:val="22"/>
@@ -1371,7 +1361,6 @@
         <w:t>inmueble.superficie</w:t>
       </w:r>
       <w:proofErr w:type="spellEnd"/>
-      <w:proofErr w:type="gramEnd"/>
       <w:r>
         <w:rPr>
           <w:sz w:val="22"/>
@@ -1416,7 +1405,6 @@
         <w:t>{{</w:t>
       </w:r>
       <w:proofErr w:type="spellStart"/>
-      <w:proofErr w:type="gramStart"/>
       <w:r>
         <w:rPr>
           <w:bCs w:val="0"/>
@@ -1435,7 +1423,6 @@
         </w:rPr>
         <w:t>superficie</w:t>
       </w:r>
-      <w:proofErr w:type="gramEnd"/>
       <w:r>
         <w:rPr>
           <w:bCs w:val="0"/>
@@ -1900,29 +1887,17 @@
           <w:szCs w:val="22"/>
           <w:lang w:val="es-MX"/>
         </w:rPr>
-        <w:t xml:space="preserve">CERTIFICADO DE LIBERTAD DE </w:t>
-      </w:r>
-      <w:proofErr w:type="gramStart"/>
+        <w:t>CERTIFICADO DE LIBERTAD DE GRAVAMEN.</w:t>
+      </w:r>
       <w:r>
         <w:rPr>
           <w:rStyle w:val="Cuerpodeltexto2105pto2"/>
-          <w:b/>
           <w:sz w:val="22"/>
           <w:szCs w:val="22"/>
           <w:lang w:val="es-MX"/>
         </w:rPr>
-        <w:t>GRAVAMEN.</w:t>
-      </w:r>
-      <w:r>
-        <w:rPr>
-          <w:rStyle w:val="Cuerpodeltexto2105pto2"/>
-          <w:sz w:val="22"/>
-          <w:szCs w:val="22"/>
-          <w:lang w:val="es-MX"/>
-        </w:rPr>
         <w:t>-</w:t>
       </w:r>
-      <w:proofErr w:type="gramEnd"/>
       <w:r>
         <w:rPr>
           <w:sz w:val="22"/>
@@ -2546,6 +2521,8 @@
         <w:jc w:val="both"/>
         <w:rPr>
           <w:rFonts w:ascii="Arial" w:hAnsi="Arial" w:cs="Arial"/>
+          <w:bCs/>
+          <w:color w:val="auto"/>
           <w:sz w:val="22"/>
           <w:szCs w:val="22"/>
         </w:rPr>
@@ -4785,7 +4762,6 @@
         <w:t>{{</w:t>
       </w:r>
       <w:proofErr w:type="spellStart"/>
-      <w:proofErr w:type="gramStart"/>
       <w:r>
         <w:rPr>
           <w:rStyle w:val="spellingerror"/>
@@ -4800,7 +4776,6 @@
         <w:t>comprador.nombre</w:t>
       </w:r>
       <w:proofErr w:type="spellEnd"/>
-      <w:proofErr w:type="gramEnd"/>
       <w:r>
         <w:rPr>
           <w:rStyle w:val="spellingerror"/>
@@ -4815,6 +4790,235 @@
         <w:t>}}</w:t>
       </w:r>
       <w:r>
+        <w:t xml:space="preserve"> </w:t>
+      </w:r>
+      <w:r>
+        <w:rPr>
+          <w:rFonts w:ascii="Arial" w:hAnsi="Arial" w:cs="Arial"/>
+          <w:sz w:val="22"/>
+          <w:szCs w:val="22"/>
+        </w:rPr>
+        <w:t>manifiesta y garantiza a la parte</w:t>
+      </w:r>
+      <w:r>
+        <w:rPr>
+          <w:rFonts w:ascii="Arial" w:hAnsi="Arial" w:cs="Arial"/>
+          <w:sz w:val="22"/>
+          <w:szCs w:val="22"/>
+        </w:rPr>
+        <w:t xml:space="preserve"> </w:t>
+      </w:r>
+      <w:r>
+        <w:rPr>
+          <w:rFonts w:ascii="Arial" w:hAnsi="Arial" w:cs="Arial"/>
+          <w:sz w:val="22"/>
+          <w:szCs w:val="22"/>
+        </w:rPr>
+        <w:t>vendedora, para los efectos de las disposiciones contenidas en los artículos 400</w:t>
+      </w:r>
+      <w:r>
+        <w:rPr>
+          <w:rFonts w:ascii="Arial" w:hAnsi="Arial" w:cs="Arial"/>
+          <w:sz w:val="22"/>
+          <w:szCs w:val="22"/>
+        </w:rPr>
+        <w:t xml:space="preserve"> </w:t>
+      </w:r>
+      <w:r>
+        <w:rPr>
+          <w:rFonts w:ascii="Arial" w:hAnsi="Arial" w:cs="Arial"/>
+          <w:sz w:val="22"/>
+          <w:szCs w:val="22"/>
+        </w:rPr>
+        <w:t>y 400 bis, del Código Penal Federal, que los recursos utilizados para cubrir sus</w:t>
+      </w:r>
+      <w:r>
+        <w:rPr>
+          <w:rFonts w:ascii="Arial" w:hAnsi="Arial" w:cs="Arial"/>
+          <w:sz w:val="22"/>
+          <w:szCs w:val="22"/>
+        </w:rPr>
+        <w:t xml:space="preserve"> </w:t>
+      </w:r>
+      <w:r>
+        <w:rPr>
+          <w:rFonts w:ascii="Arial" w:hAnsi="Arial" w:cs="Arial"/>
+          <w:sz w:val="22"/>
+          <w:szCs w:val="22"/>
+        </w:rPr>
+        <w:t xml:space="preserve">obligaciones de pago de este </w:t>
+      </w:r>
+      <w:r>
+        <w:rPr>
+          <w:rFonts w:ascii="Arial" w:hAnsi="Arial" w:cs="Arial"/>
+          <w:sz w:val="22"/>
+          <w:szCs w:val="22"/>
+        </w:rPr>
+        <w:t>contrato</w:t>
+      </w:r>
+      <w:r>
+        <w:rPr>
+          <w:rFonts w:ascii="Arial" w:hAnsi="Arial" w:cs="Arial"/>
+          <w:sz w:val="22"/>
+          <w:szCs w:val="22"/>
+        </w:rPr>
+        <w:t xml:space="preserve"> son de origen licito y como consecuencia</w:t>
+      </w:r>
+      <w:r>
+        <w:rPr>
+          <w:rFonts w:ascii="Arial" w:hAnsi="Arial" w:cs="Arial"/>
+          <w:sz w:val="22"/>
+          <w:szCs w:val="22"/>
+        </w:rPr>
+        <w:t xml:space="preserve"> </w:t>
+      </w:r>
+      <w:r>
+        <w:rPr>
+          <w:rFonts w:ascii="Arial" w:hAnsi="Arial" w:cs="Arial"/>
+          <w:sz w:val="22"/>
+          <w:szCs w:val="22"/>
+        </w:rPr>
+        <w:t xml:space="preserve">de transacciones legales llevadas a cabo por la </w:t>
+      </w:r>
+      <w:r>
+        <w:rPr>
+          <w:rFonts w:ascii="Arial" w:hAnsi="Arial" w:cs="Arial"/>
+          <w:sz w:val="22"/>
+          <w:szCs w:val="22"/>
+        </w:rPr>
+        <w:t xml:space="preserve">parte </w:t>
+      </w:r>
+      <w:r>
+        <w:rPr>
+          <w:rFonts w:ascii="Arial" w:hAnsi="Arial" w:cs="Arial"/>
+          <w:sz w:val="22"/>
+          <w:szCs w:val="22"/>
+        </w:rPr>
+        <w:t>compradora.</w:t>
+      </w:r>
+      <w:r>
+        <w:rPr>
+          <w:rFonts w:ascii="Arial" w:hAnsi="Arial" w:cs="Arial"/>
+          <w:sz w:val="22"/>
+          <w:szCs w:val="22"/>
+        </w:rPr>
+        <w:t xml:space="preserve"> - - -</w:t>
+      </w:r>
+      <w:r>
+        <w:rPr>
+          <w:rFonts w:ascii="Arial" w:hAnsi="Arial" w:cs="Arial"/>
+          <w:sz w:val="22"/>
+          <w:szCs w:val="22"/>
+        </w:rPr>
+        <w:t xml:space="preserve"> - - - - - - - - - - - -</w:t>
+      </w:r>
+      <w:r>
+        <w:rPr>
+          <w:rFonts w:ascii="Arial" w:hAnsi="Arial" w:cs="Arial"/>
+          <w:sz w:val="22"/>
+          <w:szCs w:val="22"/>
+        </w:rPr>
+        <w:t xml:space="preserve"> - - - - - </w:t>
+      </w:r>
+      <w:r>
+        <w:rPr>
+          <w:rStyle w:val="Cuerpodeltexto51"/>
+          <w:sz w:val="22"/>
+          <w:szCs w:val="22"/>
+          <w:lang w:val="es-MX"/>
+        </w:rPr>
+        <w:t>CUARTA</w:t>
+      </w:r>
+      <w:r>
+        <w:rPr>
+          <w:rFonts w:ascii="Arial" w:hAnsi="Arial" w:cs="Arial"/>
+          <w:sz w:val="22"/>
+          <w:szCs w:val="22"/>
+        </w:rPr>
+        <w:t xml:space="preserve">- - - - - - - - - - - - - - - - - - - - - </w:t>
+      </w:r>
+      <w:r>
+        <w:rPr>
+          <w:rFonts w:ascii="Arial" w:hAnsi="Arial" w:cs="Arial"/>
+          <w:sz w:val="22"/>
+          <w:szCs w:val="22"/>
+        </w:rPr>
+        <w:t xml:space="preserve">- </w:t>
+      </w:r>
+      <w:r>
+        <w:rPr>
+          <w:rFonts w:ascii="Arial" w:hAnsi="Arial" w:cs="Arial"/>
+          <w:sz w:val="22"/>
+          <w:szCs w:val="22"/>
+        </w:rPr>
+        <w:t>-</w:t>
+      </w:r>
+      <w:r>
+        <w:rPr>
+          <w:rFonts w:ascii="Arial" w:hAnsi="Arial" w:cs="Arial"/>
+          <w:sz w:val="22"/>
+          <w:szCs w:val="22"/>
+        </w:rPr>
+        <w:t xml:space="preserve"> </w:t>
+      </w:r>
+      <w:r>
+        <w:rPr>
+          <w:rFonts w:ascii="Arial" w:hAnsi="Arial" w:cs="Arial"/>
+          <w:sz w:val="22"/>
+          <w:szCs w:val="22"/>
+        </w:rPr>
+        <w:t xml:space="preserve">- - </w:t>
+      </w:r>
+      <w:r>
+        <w:rPr>
+          <w:rFonts w:ascii="Arial" w:hAnsi="Arial" w:cs="Arial"/>
+          <w:sz w:val="22"/>
+          <w:szCs w:val="22"/>
+        </w:rPr>
+        <w:t xml:space="preserve">- </w:t>
+      </w:r>
+      <w:r>
+        <w:rPr>
+          <w:rFonts w:ascii="Arial" w:hAnsi="Arial" w:cs="Arial"/>
+          <w:sz w:val="22"/>
+          <w:szCs w:val="22"/>
+        </w:rPr>
+        <w:t xml:space="preserve">Para efectos de lo dispuesto por la Ley Federal para la Prevención e Identificación de Operaciones con Recursos de Procedencia Ilícita los otorgantes manifiestan que el otorgamiento del presente instrumento no implica el establecimiento de una relación de negocios, por tratarse de un acto u operación </w:t>
+      </w:r>
+      <w:r>
+        <w:rPr>
+          <w:rFonts w:ascii="Arial" w:hAnsi="Arial" w:cs="Arial"/>
+          <w:sz w:val="22"/>
+          <w:szCs w:val="22"/>
+        </w:rPr>
+        <w:lastRenderedPageBreak/>
+        <w:t xml:space="preserve">que se celebra ocasionalmente y no como producto de una relación formal y cotidiana entre el suscrito notario y los otorgantes.- - - - - - - - - - - - - - - - - - - - - - - - - - - - - </w:t>
+      </w:r>
+      <w:r>
+        <w:rPr>
+          <w:rFonts w:ascii="Arial" w:hAnsi="Arial" w:cs="Arial"/>
+          <w:sz w:val="22"/>
+          <w:szCs w:val="22"/>
+        </w:rPr>
+        <w:t xml:space="preserve">- - </w:t>
+      </w:r>
+      <w:r>
+        <w:rPr>
+          <w:rFonts w:ascii="Arial" w:hAnsi="Arial" w:cs="Arial"/>
+          <w:sz w:val="22"/>
+          <w:szCs w:val="22"/>
+        </w:rPr>
+        <w:t>- - - - - - - - - - -</w:t>
+      </w:r>
+      <w:r>
+        <w:rPr>
+          <w:rFonts w:ascii="Arial" w:hAnsi="Arial" w:cs="Arial"/>
+          <w:sz w:val="22"/>
+          <w:szCs w:val="22"/>
+        </w:rPr>
+        <w:t xml:space="preserve"> </w:t>
+      </w:r>
+      <w:r>
         <w:rPr>
           <w:rFonts w:ascii="Arial" w:hAnsi="Arial" w:cs="Arial"/>
           <w:b/>
@@ -4823,155 +5027,23 @@
           <w:szCs w:val="22"/>
           <w:u w:val="single"/>
         </w:rPr>
-        <w:t>,</w:t>
-      </w:r>
-      <w:r>
-        <w:t xml:space="preserve"> </w:t>
-      </w:r>
-      <w:r>
-        <w:rPr>
-          <w:rFonts w:ascii="Arial" w:hAnsi="Arial" w:cs="Arial"/>
-          <w:sz w:val="22"/>
-          <w:szCs w:val="22"/>
-        </w:rPr>
-        <w:t>manifiesta y garantiza a la parte</w:t>
-      </w:r>
-      <w:r>
-        <w:rPr>
-          <w:rFonts w:ascii="Arial" w:hAnsi="Arial" w:cs="Arial"/>
-          <w:sz w:val="22"/>
-          <w:szCs w:val="22"/>
-        </w:rPr>
-        <w:t xml:space="preserve"> </w:t>
-      </w:r>
-      <w:r>
-        <w:rPr>
-          <w:rFonts w:ascii="Arial" w:hAnsi="Arial" w:cs="Arial"/>
-          <w:sz w:val="22"/>
-          <w:szCs w:val="22"/>
-        </w:rPr>
-        <w:t>vendedora, para los efectos de las disposiciones contenidas en los artículos 400</w:t>
-      </w:r>
-      <w:r>
-        <w:rPr>
-          <w:rFonts w:ascii="Arial" w:hAnsi="Arial" w:cs="Arial"/>
-          <w:sz w:val="22"/>
-          <w:szCs w:val="22"/>
-        </w:rPr>
-        <w:t xml:space="preserve"> </w:t>
-      </w:r>
-      <w:r>
-        <w:rPr>
-          <w:rFonts w:ascii="Arial" w:hAnsi="Arial" w:cs="Arial"/>
-          <w:sz w:val="22"/>
-          <w:szCs w:val="22"/>
-        </w:rPr>
-        <w:t>y 400 bis, del Código Penal Federal, que los recursos utilizados para cubrir sus</w:t>
-      </w:r>
-      <w:r>
-        <w:rPr>
-          <w:rFonts w:ascii="Arial" w:hAnsi="Arial" w:cs="Arial"/>
-          <w:sz w:val="22"/>
-          <w:szCs w:val="22"/>
-        </w:rPr>
-        <w:t xml:space="preserve"> </w:t>
-      </w:r>
-      <w:r>
-        <w:rPr>
-          <w:rFonts w:ascii="Arial" w:hAnsi="Arial" w:cs="Arial"/>
-          <w:sz w:val="22"/>
-          <w:szCs w:val="22"/>
-        </w:rPr>
-        <w:t xml:space="preserve">obligaciones de pago de este </w:t>
-      </w:r>
-      <w:r>
-        <w:rPr>
-          <w:rFonts w:ascii="Arial" w:hAnsi="Arial" w:cs="Arial"/>
-          <w:sz w:val="22"/>
-          <w:szCs w:val="22"/>
-        </w:rPr>
-        <w:t>contrato</w:t>
-      </w:r>
-      <w:r>
-        <w:rPr>
-          <w:rFonts w:ascii="Arial" w:hAnsi="Arial" w:cs="Arial"/>
-          <w:sz w:val="22"/>
-          <w:szCs w:val="22"/>
-        </w:rPr>
-        <w:t xml:space="preserve"> son de origen licito y como consecuencia</w:t>
-      </w:r>
-      <w:r>
-        <w:rPr>
-          <w:rFonts w:ascii="Arial" w:hAnsi="Arial" w:cs="Arial"/>
-          <w:sz w:val="22"/>
-          <w:szCs w:val="22"/>
-        </w:rPr>
-        <w:t xml:space="preserve"> </w:t>
-      </w:r>
-      <w:r>
-        <w:rPr>
-          <w:rFonts w:ascii="Arial" w:hAnsi="Arial" w:cs="Arial"/>
-          <w:sz w:val="22"/>
-          <w:szCs w:val="22"/>
-        </w:rPr>
-        <w:t xml:space="preserve">de transacciones legales llevadas a cabo por la </w:t>
-      </w:r>
-      <w:r>
-        <w:rPr>
-          <w:rFonts w:ascii="Arial" w:hAnsi="Arial" w:cs="Arial"/>
-          <w:sz w:val="22"/>
-          <w:szCs w:val="22"/>
-        </w:rPr>
-        <w:t xml:space="preserve">parte </w:t>
-      </w:r>
-      <w:r>
-        <w:rPr>
-          <w:rFonts w:ascii="Arial" w:hAnsi="Arial" w:cs="Arial"/>
-          <w:sz w:val="22"/>
-          <w:szCs w:val="22"/>
-        </w:rPr>
-        <w:t>compradora.</w:t>
-      </w:r>
-      <w:r>
-        <w:rPr>
-          <w:rFonts w:ascii="Arial" w:hAnsi="Arial" w:cs="Arial"/>
-          <w:sz w:val="22"/>
-          <w:szCs w:val="22"/>
-        </w:rPr>
-        <w:t xml:space="preserve"> - - -</w:t>
-      </w:r>
-      <w:r>
-        <w:rPr>
-          <w:rFonts w:ascii="Arial" w:hAnsi="Arial" w:cs="Arial"/>
-          <w:sz w:val="22"/>
-          <w:szCs w:val="22"/>
-        </w:rPr>
-        <w:t xml:space="preserve"> - - - - - - - - - - - -</w:t>
-      </w:r>
-      <w:r>
-        <w:rPr>
-          <w:rFonts w:ascii="Arial" w:hAnsi="Arial" w:cs="Arial"/>
-          <w:sz w:val="22"/>
-          <w:szCs w:val="22"/>
-        </w:rPr>
-        <w:t xml:space="preserve"> - - - - - </w:t>
-      </w:r>
-      <w:r>
-        <w:rPr>
-          <w:rStyle w:val="Cuerpodeltexto51"/>
-          <w:sz w:val="22"/>
-          <w:szCs w:val="22"/>
-          <w:lang w:val="es-MX"/>
-        </w:rPr>
-        <w:t>CUARTA</w:t>
-      </w:r>
-      <w:r>
-        <w:rPr>
-          <w:rFonts w:ascii="Arial" w:hAnsi="Arial" w:cs="Arial"/>
-          <w:sz w:val="22"/>
-          <w:szCs w:val="22"/>
-        </w:rPr>
-        <w:t xml:space="preserve">- - - - - - - - - - - - - - - - - - - - - </w:t>
+        <w:t>Q    U    I    N    T   A</w:t>
+      </w:r>
+      <w:r>
+        <w:rPr>
+          <w:rFonts w:ascii="Arial" w:hAnsi="Arial" w:cs="Arial"/>
+          <w:sz w:val="22"/>
+          <w:szCs w:val="22"/>
+        </w:rPr>
+        <w:t xml:space="preserve"> - - - - - - - - - - - - - - - - - - - - - - - -</w:t>
+      </w:r>
+      <w:r>
+        <w:rPr>
+          <w:rFonts w:ascii="Arial" w:hAnsi="Arial" w:cs="Arial"/>
+          <w:sz w:val="22"/>
+          <w:szCs w:val="22"/>
+        </w:rPr>
+        <w:t xml:space="preserve"> - </w:t>
       </w:r>
       <w:r>
         <w:rPr>
@@ -4987,72 +5059,39 @@
           <w:sz w:val="22"/>
           <w:szCs w:val="22"/>
         </w:rPr>
-        <w:t>-</w:t>
-      </w:r>
-      <w:r>
-        <w:rPr>
-          <w:rFonts w:ascii="Arial" w:hAnsi="Arial" w:cs="Arial"/>
-          <w:sz w:val="22"/>
-          <w:szCs w:val="22"/>
-        </w:rPr>
-        <w:t xml:space="preserve"> </w:t>
-      </w:r>
-      <w:r>
-        <w:rPr>
-          <w:rFonts w:ascii="Arial" w:hAnsi="Arial" w:cs="Arial"/>
-          <w:sz w:val="22"/>
-          <w:szCs w:val="22"/>
-        </w:rPr>
-        <w:t xml:space="preserve">- - </w:t>
-      </w:r>
-      <w:r>
-        <w:rPr>
-          <w:rFonts w:ascii="Arial" w:hAnsi="Arial" w:cs="Arial"/>
-          <w:sz w:val="22"/>
-          <w:szCs w:val="22"/>
-        </w:rPr>
-        <w:t xml:space="preserve">- </w:t>
-      </w:r>
-      <w:r>
-        <w:rPr>
-          <w:rFonts w:ascii="Arial" w:hAnsi="Arial" w:cs="Arial"/>
-          <w:sz w:val="22"/>
-          <w:szCs w:val="22"/>
-        </w:rPr>
-        <w:t xml:space="preserve">Para efectos de lo dispuesto por la Ley Federal para la Prevención e Identificación de Operaciones con Recursos de Procedencia Ilícita los otorgantes manifiestan que el otorgamiento del presente instrumento no implica el establecimiento de una relación de negocios, por tratarse de un acto u operación </w:t>
-      </w:r>
-      <w:r>
-        <w:rPr>
-          <w:rFonts w:ascii="Arial" w:hAnsi="Arial" w:cs="Arial"/>
-          <w:sz w:val="22"/>
-          <w:szCs w:val="22"/>
-        </w:rPr>
-        <w:lastRenderedPageBreak/>
-        <w:t xml:space="preserve">que se celebra ocasionalmente y no como producto de una relación formal y cotidiana entre el suscrito notario y los otorgantes.- - - - - - - - - - - - - - - - - - - - - - - - - - - - - </w:t>
-      </w:r>
-      <w:r>
-        <w:rPr>
-          <w:rFonts w:ascii="Arial" w:hAnsi="Arial" w:cs="Arial"/>
-          <w:sz w:val="22"/>
-          <w:szCs w:val="22"/>
-        </w:rPr>
-        <w:t xml:space="preserve">- - </w:t>
-      </w:r>
-      <w:r>
-        <w:rPr>
-          <w:rFonts w:ascii="Arial" w:hAnsi="Arial" w:cs="Arial"/>
-          <w:sz w:val="22"/>
-          <w:szCs w:val="22"/>
-        </w:rPr>
-        <w:t>- - - - - - - - - - -</w:t>
-      </w:r>
-      <w:r>
-        <w:rPr>
-          <w:rFonts w:ascii="Arial" w:hAnsi="Arial" w:cs="Arial"/>
-          <w:sz w:val="22"/>
-          <w:szCs w:val="22"/>
-        </w:rPr>
-        <w:t xml:space="preserve"> </w:t>
+        <w:t>Los contratantes convienen y reconocen que en este contrato de compra venta, no existe vicio alguno del consentimiento, ni se enriquece ninguno de ellos en detrimento del otro en forma ilícita, razón por la cual renuncian expresamente a las acciones de nulidad o rescisión de este contrato; obligándose en este acto la parte vendedora a responder siempre en favor de la parte compradora, respecto al saneamiento y la evicción de esta venta en los términos que marca la ley, y queda expresamente convenido que serán por cuenta exclusiva de la parte vendedora cualquier adeudo o responsabilidad a cargo del inmueble objeto de esta escritura, que sean anteriores a la fecha de este otorgamiento.- - - - - - - - - - - - - - - - - - - - - -</w:t>
+      </w:r>
+      <w:r>
+        <w:rPr>
+          <w:rFonts w:ascii="Arial" w:hAnsi="Arial" w:cs="Arial"/>
+          <w:sz w:val="22"/>
+          <w:szCs w:val="22"/>
+        </w:rPr>
+        <w:t xml:space="preserve"> -</w:t>
+      </w:r>
+      <w:r>
+        <w:rPr>
+          <w:rFonts w:ascii="Arial" w:hAnsi="Arial" w:cs="Arial"/>
+          <w:sz w:val="22"/>
+          <w:szCs w:val="22"/>
+        </w:rPr>
+        <w:t xml:space="preserve"> </w:t>
+      </w:r>
+      <w:r>
+        <w:rPr>
+          <w:rFonts w:ascii="Arial" w:hAnsi="Arial" w:cs="Arial"/>
+          <w:sz w:val="22"/>
+          <w:szCs w:val="22"/>
+        </w:rPr>
+        <w:t xml:space="preserve">- - - - </w:t>
+      </w:r>
+      <w:r>
+        <w:rPr>
+          <w:rFonts w:ascii="Arial" w:hAnsi="Arial" w:cs="Arial"/>
+          <w:sz w:val="22"/>
+          <w:szCs w:val="22"/>
+        </w:rPr>
+        <w:t xml:space="preserve">- - - </w:t>
       </w:r>
       <w:r>
         <w:rPr>
@@ -5063,71 +5102,63 @@
           <w:szCs w:val="22"/>
           <w:u w:val="single"/>
         </w:rPr>
-        <w:t>Q    U    I    N    T   A</w:t>
-      </w:r>
-      <w:r>
-        <w:rPr>
-          <w:rFonts w:ascii="Arial" w:hAnsi="Arial" w:cs="Arial"/>
-          <w:sz w:val="22"/>
-          <w:szCs w:val="22"/>
-        </w:rPr>
-        <w:t xml:space="preserve"> - - - - - - - - - - - - - - - - - - - - - - - -</w:t>
-      </w:r>
-      <w:r>
-        <w:rPr>
-          <w:rFonts w:ascii="Arial" w:hAnsi="Arial" w:cs="Arial"/>
-          <w:sz w:val="22"/>
-          <w:szCs w:val="22"/>
-        </w:rPr>
-        <w:t xml:space="preserve"> - </w:t>
-      </w:r>
-      <w:r>
-        <w:rPr>
-          <w:rFonts w:ascii="Arial" w:hAnsi="Arial" w:cs="Arial"/>
-          <w:sz w:val="22"/>
-          <w:szCs w:val="22"/>
-        </w:rPr>
-        <w:t xml:space="preserve">- </w:t>
-      </w:r>
-      <w:r>
-        <w:rPr>
-          <w:rFonts w:ascii="Arial" w:hAnsi="Arial" w:cs="Arial"/>
-          <w:sz w:val="22"/>
-          <w:szCs w:val="22"/>
-        </w:rPr>
-        <w:t>Los contratantes convienen y reconocen que en este contrato de compra venta, no existe vicio alguno del consentimiento, ni se enriquece ninguno de ellos en detrimento del otro en forma ilícita, razón por la cual renuncian expresamente a las acciones de nulidad o rescisión de este contrato; obligándose en este acto la parte vendedora a responder siempre en favor de la parte compradora, respecto al saneamiento y la evicción de esta venta en los términos que marca la ley, y queda expresamente convenido que serán por cuenta exclusiva de la parte vendedora cualquier adeudo o responsabilidad a cargo del inmueble objeto de esta escritura, que sean anteriores a la fecha de este otorgamiento.- - - - - - - - - - - - - - - - - - - - - -</w:t>
-      </w:r>
-      <w:r>
-        <w:rPr>
-          <w:rFonts w:ascii="Arial" w:hAnsi="Arial" w:cs="Arial"/>
-          <w:sz w:val="22"/>
-          <w:szCs w:val="22"/>
-        </w:rPr>
-        <w:t xml:space="preserve"> -</w:t>
-      </w:r>
-      <w:r>
-        <w:rPr>
-          <w:rFonts w:ascii="Arial" w:hAnsi="Arial" w:cs="Arial"/>
-          <w:sz w:val="22"/>
-          <w:szCs w:val="22"/>
-        </w:rPr>
-        <w:t xml:space="preserve"> </w:t>
-      </w:r>
-      <w:r>
-        <w:rPr>
-          <w:rFonts w:ascii="Arial" w:hAnsi="Arial" w:cs="Arial"/>
-          <w:sz w:val="22"/>
-          <w:szCs w:val="22"/>
-        </w:rPr>
-        <w:t xml:space="preserve">- - - - </w:t>
-      </w:r>
-      <w:r>
-        <w:rPr>
-          <w:rFonts w:ascii="Arial" w:hAnsi="Arial" w:cs="Arial"/>
-          <w:sz w:val="22"/>
-          <w:szCs w:val="22"/>
-        </w:rPr>
-        <w:t xml:space="preserve">- - - </w:t>
+        <w:t>S   E   X   T   A</w:t>
+      </w:r>
+      <w:r>
+        <w:rPr>
+          <w:rFonts w:ascii="Arial" w:hAnsi="Arial" w:cs="Arial"/>
+          <w:sz w:val="22"/>
+          <w:szCs w:val="22"/>
+        </w:rPr>
+        <w:t xml:space="preserve"> - - - - - - - </w:t>
+      </w:r>
+      <w:r>
+        <w:rPr>
+          <w:rFonts w:ascii="Arial" w:hAnsi="Arial" w:cs="Arial"/>
+          <w:sz w:val="22"/>
+          <w:szCs w:val="22"/>
+        </w:rPr>
+        <w:t>- - - - - - - - - - - - - - - - - -</w:t>
+      </w:r>
+      <w:r>
+        <w:rPr>
+          <w:rFonts w:ascii="Arial" w:hAnsi="Arial" w:cs="Arial"/>
+          <w:sz w:val="22"/>
+          <w:szCs w:val="22"/>
+        </w:rPr>
+        <w:t xml:space="preserve"> - - </w:t>
+      </w:r>
+      <w:r>
+        <w:rPr>
+          <w:rFonts w:ascii="Arial" w:hAnsi="Arial" w:cs="Arial"/>
+          <w:sz w:val="22"/>
+          <w:szCs w:val="22"/>
+        </w:rPr>
+        <w:t xml:space="preserve">Las partes contratantes declaran saber que el pago de los impuestos originados por el presente otorgamiento están sujetos a revisión por parte de las autoridades fiscales, por lo que si existiere alguna diferencia a su cargo, se obligan a cubrirla tan pronto como les sea notificada, inclusive con los recargos y multas que se impongan por falta de pago oportuno, liberando en consecuencia al suscrito notario de cualquier responsabilidad al respecto.- - - - - - - - - - - - - - - - - - - - - - - - - - - - </w:t>
+      </w:r>
+      <w:r>
+        <w:rPr>
+          <w:rFonts w:ascii="Arial" w:hAnsi="Arial" w:cs="Arial"/>
+          <w:sz w:val="22"/>
+          <w:szCs w:val="22"/>
+        </w:rPr>
+        <w:t xml:space="preserve">- - </w:t>
+      </w:r>
+      <w:r>
+        <w:rPr>
+          <w:rFonts w:ascii="Arial" w:hAnsi="Arial" w:cs="Arial"/>
+          <w:sz w:val="22"/>
+          <w:szCs w:val="22"/>
+        </w:rPr>
+        <w:t>- - - - - -</w:t>
+      </w:r>
+      <w:r>
+        <w:rPr>
+          <w:rFonts w:ascii="Arial" w:hAnsi="Arial" w:cs="Arial"/>
+          <w:sz w:val="22"/>
+          <w:szCs w:val="22"/>
+        </w:rPr>
+        <w:t xml:space="preserve"> </w:t>
       </w:r>
       <w:r>
         <w:rPr>
@@ -5138,63 +5169,55 @@
           <w:szCs w:val="22"/>
           <w:u w:val="single"/>
         </w:rPr>
-        <w:t>S   E   X   T   A</w:t>
-      </w:r>
-      <w:r>
-        <w:rPr>
-          <w:rFonts w:ascii="Arial" w:hAnsi="Arial" w:cs="Arial"/>
-          <w:sz w:val="22"/>
-          <w:szCs w:val="22"/>
-        </w:rPr>
-        <w:t xml:space="preserve"> - - - - - - - </w:t>
-      </w:r>
-      <w:r>
-        <w:rPr>
-          <w:rFonts w:ascii="Arial" w:hAnsi="Arial" w:cs="Arial"/>
-          <w:sz w:val="22"/>
-          <w:szCs w:val="22"/>
-        </w:rPr>
-        <w:t>- - - - - - - - - - - - - - - - - -</w:t>
-      </w:r>
-      <w:r>
-        <w:rPr>
-          <w:rFonts w:ascii="Arial" w:hAnsi="Arial" w:cs="Arial"/>
-          <w:sz w:val="22"/>
-          <w:szCs w:val="22"/>
-        </w:rPr>
-        <w:t xml:space="preserve"> - - </w:t>
-      </w:r>
-      <w:r>
-        <w:rPr>
-          <w:rFonts w:ascii="Arial" w:hAnsi="Arial" w:cs="Arial"/>
-          <w:sz w:val="22"/>
-          <w:szCs w:val="22"/>
-        </w:rPr>
-        <w:t xml:space="preserve">Las partes contratantes declaran saber que el pago de los impuestos originados por el presente otorgamiento están sujetos a revisión por parte de las autoridades fiscales, por lo que si existiere alguna diferencia a su cargo, se obligan a cubrirla tan pronto como les sea notificada, inclusive con los recargos y multas que se impongan por falta de pago oportuno, liberando en consecuencia al suscrito notario de cualquier responsabilidad al respecto.- - - - - - - - - - - - - - - - - - - - - - - - - - - - </w:t>
-      </w:r>
-      <w:r>
-        <w:rPr>
-          <w:rFonts w:ascii="Arial" w:hAnsi="Arial" w:cs="Arial"/>
-          <w:sz w:val="22"/>
-          <w:szCs w:val="22"/>
-        </w:rPr>
-        <w:t xml:space="preserve">- - </w:t>
-      </w:r>
-      <w:r>
-        <w:rPr>
-          <w:rFonts w:ascii="Arial" w:hAnsi="Arial" w:cs="Arial"/>
-          <w:sz w:val="22"/>
-          <w:szCs w:val="22"/>
-        </w:rPr>
-        <w:t>- - - - - -</w:t>
-      </w:r>
-      <w:r>
-        <w:rPr>
-          <w:rFonts w:ascii="Arial" w:hAnsi="Arial" w:cs="Arial"/>
-          <w:sz w:val="22"/>
-          <w:szCs w:val="22"/>
-        </w:rPr>
-        <w:t xml:space="preserve"> </w:t>
+        <w:t>S   E   P   T   I   M   A</w:t>
+      </w:r>
+      <w:r>
+        <w:rPr>
+          <w:rFonts w:ascii="Arial" w:hAnsi="Arial" w:cs="Arial"/>
+          <w:sz w:val="22"/>
+          <w:szCs w:val="22"/>
+        </w:rPr>
+        <w:t xml:space="preserve"> - - - - - - - - - - - - - - - - - - - - - - -</w:t>
+      </w:r>
+      <w:r>
+        <w:rPr>
+          <w:rFonts w:ascii="Arial" w:hAnsi="Arial" w:cs="Arial"/>
+          <w:sz w:val="22"/>
+          <w:szCs w:val="22"/>
+        </w:rPr>
+        <w:t xml:space="preserve"> - </w:t>
+      </w:r>
+      <w:r>
+        <w:rPr>
+          <w:rFonts w:ascii="Arial" w:hAnsi="Arial" w:cs="Arial"/>
+          <w:sz w:val="22"/>
+          <w:szCs w:val="22"/>
+        </w:rPr>
+        <w:t xml:space="preserve">- </w:t>
+      </w:r>
+      <w:r>
+        <w:rPr>
+          <w:rFonts w:ascii="Arial" w:hAnsi="Arial" w:cs="Arial"/>
+          <w:sz w:val="22"/>
+          <w:szCs w:val="22"/>
+        </w:rPr>
+        <w:t>Declara la parte vendedora, respecto al Impuesto sobre la renta por enajenación de bienes, enterará el pago provisional de conformidad con la liquidación que contiene la información relativa a la determinación del cálculo del impuesto, de la que un ejemplar entregué a la parte vendedora, quien en otro ejemplar igual firmó de recibido, y que agrego al apéndice de este instrumento con la letra “B”.- - - - - - - - - - - - - - - - - - - - - - - - - - - - - - - - - - - - - - - - - - - - - - - - - - - - - - - - - - - - - - - -</w:t>
+      </w:r>
+      <w:r>
+        <w:rPr>
+          <w:rFonts w:ascii="Arial" w:hAnsi="Arial" w:cs="Arial"/>
+          <w:sz w:val="22"/>
+          <w:szCs w:val="22"/>
+        </w:rPr>
+        <w:t xml:space="preserve"> - -</w:t>
+      </w:r>
+      <w:r>
+        <w:rPr>
+          <w:rFonts w:ascii="Arial" w:hAnsi="Arial" w:cs="Arial"/>
+          <w:sz w:val="22"/>
+          <w:szCs w:val="22"/>
+        </w:rPr>
+        <w:t xml:space="preserve"> - - - - - </w:t>
       </w:r>
       <w:r>
         <w:rPr>
@@ -5205,15 +5228,15 @@
           <w:szCs w:val="22"/>
           <w:u w:val="single"/>
         </w:rPr>
-        <w:t>S   E   P   T   I   M   A</w:t>
-      </w:r>
-      <w:r>
-        <w:rPr>
-          <w:rFonts w:ascii="Arial" w:hAnsi="Arial" w:cs="Arial"/>
-          <w:sz w:val="22"/>
-          <w:szCs w:val="22"/>
-        </w:rPr>
-        <w:t xml:space="preserve"> - - - - - - - - - - - - - - - - - - - - - - -</w:t>
+        <w:t>O C T A V A</w:t>
+      </w:r>
+      <w:r>
+        <w:rPr>
+          <w:rFonts w:ascii="Arial" w:hAnsi="Arial" w:cs="Arial"/>
+          <w:sz w:val="22"/>
+          <w:szCs w:val="22"/>
+        </w:rPr>
+        <w:t xml:space="preserve"> - - - - - - - - - - - - - - - - - - - - - - - - - - -</w:t>
       </w:r>
       <w:r>
         <w:rPr>
@@ -5229,6 +5252,14 @@
           <w:sz w:val="22"/>
           <w:szCs w:val="22"/>
         </w:rPr>
+        <w:t xml:space="preserve">Las partes contratantes convienen en someterse para toda interpretación, cumplimiento y ejecución de lo pactado en este contrato, con la renuncia expresa del fuero de sus domicilios presentes o futuros, a las leyes del Estado de Hidalgo, y a los tribunales competentes del Estado de Hidalgo.- - - - - - - - - - - - - - - - - - - - - - - - - - - - - - - - - - - - - - - </w:t>
+      </w:r>
+      <w:r>
+        <w:rPr>
+          <w:rFonts w:ascii="Arial" w:hAnsi="Arial" w:cs="Arial"/>
+          <w:sz w:val="22"/>
+          <w:szCs w:val="22"/>
+        </w:rPr>
         <w:t xml:space="preserve">- </w:t>
       </w:r>
       <w:r>
@@ -5237,23 +5268,15 @@
           <w:sz w:val="22"/>
           <w:szCs w:val="22"/>
         </w:rPr>
-        <w:t>Declara la parte vendedora, respecto al Impuesto sobre la renta por enajenación de bienes, enterará el pago provisional de conformidad con la liquidación que contiene la información relativa a la determinación del cálculo del impuesto, de la que un ejemplar entregué a la parte vendedora, quien en otro ejemplar igual firmó de recibido, y que agrego al apéndice de este instrumento con la letra “B”.- - - - - - - - - - - - - - - - - - - - - - - - - - - - - - - - - - - - - - - - - - - - - - - - - - - - - - - - - - - - - - - -</w:t>
-      </w:r>
-      <w:r>
-        <w:rPr>
-          <w:rFonts w:ascii="Arial" w:hAnsi="Arial" w:cs="Arial"/>
-          <w:sz w:val="22"/>
-          <w:szCs w:val="22"/>
-        </w:rPr>
-        <w:t xml:space="preserve"> - -</w:t>
-      </w:r>
-      <w:r>
-        <w:rPr>
-          <w:rFonts w:ascii="Arial" w:hAnsi="Arial" w:cs="Arial"/>
-          <w:sz w:val="22"/>
-          <w:szCs w:val="22"/>
-        </w:rPr>
-        <w:t xml:space="preserve"> - - - - - </w:t>
+        <w:t xml:space="preserve">- - </w:t>
+      </w:r>
+      <w:r>
+        <w:rPr>
+          <w:rFonts w:ascii="Arial" w:hAnsi="Arial" w:cs="Arial"/>
+          <w:sz w:val="22"/>
+          <w:szCs w:val="22"/>
+        </w:rPr>
+        <w:t xml:space="preserve">- </w:t>
       </w:r>
       <w:r>
         <w:rPr>
@@ -5264,47 +5287,39 @@
           <w:szCs w:val="22"/>
           <w:u w:val="single"/>
         </w:rPr>
-        <w:t>O C T A V A</w:t>
-      </w:r>
-      <w:r>
-        <w:rPr>
-          <w:rFonts w:ascii="Arial" w:hAnsi="Arial" w:cs="Arial"/>
-          <w:sz w:val="22"/>
-          <w:szCs w:val="22"/>
-        </w:rPr>
-        <w:t xml:space="preserve"> - - - - - - - - - - - - - - - - - - - - - - - - - - -</w:t>
-      </w:r>
-      <w:r>
-        <w:rPr>
-          <w:rFonts w:ascii="Arial" w:hAnsi="Arial" w:cs="Arial"/>
-          <w:sz w:val="22"/>
-          <w:szCs w:val="22"/>
-        </w:rPr>
-        <w:t xml:space="preserve"> - </w:t>
-      </w:r>
-      <w:r>
-        <w:rPr>
-          <w:rFonts w:ascii="Arial" w:hAnsi="Arial" w:cs="Arial"/>
-          <w:sz w:val="22"/>
-          <w:szCs w:val="22"/>
-        </w:rPr>
-        <w:t xml:space="preserve">Las partes contratantes convienen en someterse para toda interpretación, cumplimiento y ejecución de lo pactado en este contrato, con la renuncia expresa del fuero de sus domicilios presentes o futuros, a las leyes del Estado de Hidalgo, y a los tribunales competentes del Estado de Hidalgo.- - - - - - - - - - - - - - - - - - - - - - - - - - - - - - - - - - - - - - - </w:t>
-      </w:r>
-      <w:r>
-        <w:rPr>
-          <w:rFonts w:ascii="Arial" w:hAnsi="Arial" w:cs="Arial"/>
-          <w:sz w:val="22"/>
-          <w:szCs w:val="22"/>
-        </w:rPr>
-        <w:t xml:space="preserve">- </w:t>
-      </w:r>
-      <w:r>
-        <w:rPr>
-          <w:rFonts w:ascii="Arial" w:hAnsi="Arial" w:cs="Arial"/>
-          <w:sz w:val="22"/>
-          <w:szCs w:val="22"/>
-        </w:rPr>
-        <w:t xml:space="preserve">- - </w:t>
+        <w:t>N O V E N A</w:t>
+      </w:r>
+      <w:r>
+        <w:rPr>
+          <w:rFonts w:ascii="Arial" w:hAnsi="Arial" w:cs="Arial"/>
+          <w:sz w:val="22"/>
+          <w:szCs w:val="22"/>
+        </w:rPr>
+        <w:t xml:space="preserve"> - - - - - - - - - - - - - - - - - - - - - - - - - - - - Los gastos, impuestos, derechos y honorarios que en general se eroguen con motivo del otorgamiento de esta escritura, hasta inscribir su primer testimonio en el Registro Público de la Propiedad y Comercio, correspondiente serán cubiertos en forma exclusiva por la parte compradora, a excepción del impuesto Sobre la Renta, que por ley lo cubre la parte vendedora.- - - - - - - - - - - - - - - - - - - - - - - - - - - - -</w:t>
+      </w:r>
+      <w:r>
+        <w:rPr>
+          <w:rFonts w:ascii="Arial" w:hAnsi="Arial" w:cs="Arial"/>
+          <w:sz w:val="22"/>
+          <w:szCs w:val="22"/>
+        </w:rPr>
+        <w:t xml:space="preserve"> </w:t>
+      </w:r>
+      <w:r>
+        <w:rPr>
+          <w:rFonts w:ascii="Arial" w:hAnsi="Arial" w:cs="Arial"/>
+          <w:sz w:val="22"/>
+          <w:szCs w:val="22"/>
+        </w:rPr>
+        <w:t>- - - - - - - - -</w:t>
+      </w:r>
+      <w:r>
+        <w:rPr>
+          <w:rFonts w:ascii="Arial" w:hAnsi="Arial" w:cs="Arial"/>
+          <w:sz w:val="22"/>
+          <w:szCs w:val="22"/>
+        </w:rPr>
+        <w:t xml:space="preserve"> - - - </w:t>
       </w:r>
       <w:r>
         <w:rPr>
@@ -5323,47 +5338,39 @@
           <w:szCs w:val="22"/>
           <w:u w:val="single"/>
         </w:rPr>
-        <w:t>N O V E N A</w:t>
-      </w:r>
-      <w:r>
-        <w:rPr>
-          <w:rFonts w:ascii="Arial" w:hAnsi="Arial" w:cs="Arial"/>
-          <w:sz w:val="22"/>
-          <w:szCs w:val="22"/>
-        </w:rPr>
-        <w:t xml:space="preserve"> - - - - - - - - - - - - - - - - - - - - - - - - - - - - Los gastos, impuestos, derechos y honorarios que en general se eroguen con motivo del otorgamiento de esta escritura, hasta inscribir su primer testimonio en el Registro Público de la Propiedad y Comercio, correspondiente serán cubiertos en forma exclusiva por la parte compradora, a excepción del impuesto Sobre la Renta, que por ley lo cubre la parte vendedora.- - - - - - - - - - - - - - - - - - - - - - - - - - - - -</w:t>
-      </w:r>
-      <w:r>
-        <w:rPr>
-          <w:rFonts w:ascii="Arial" w:hAnsi="Arial" w:cs="Arial"/>
-          <w:sz w:val="22"/>
-          <w:szCs w:val="22"/>
-        </w:rPr>
-        <w:t xml:space="preserve"> </w:t>
-      </w:r>
-      <w:r>
-        <w:rPr>
-          <w:rFonts w:ascii="Arial" w:hAnsi="Arial" w:cs="Arial"/>
-          <w:sz w:val="22"/>
-          <w:szCs w:val="22"/>
-        </w:rPr>
-        <w:t>- - - - - - - - -</w:t>
-      </w:r>
-      <w:r>
-        <w:rPr>
-          <w:rFonts w:ascii="Arial" w:hAnsi="Arial" w:cs="Arial"/>
-          <w:sz w:val="22"/>
-          <w:szCs w:val="22"/>
-        </w:rPr>
-        <w:t xml:space="preserve"> - - - </w:t>
-      </w:r>
-      <w:r>
-        <w:rPr>
-          <w:rFonts w:ascii="Arial" w:hAnsi="Arial" w:cs="Arial"/>
-          <w:sz w:val="22"/>
-          <w:szCs w:val="22"/>
-        </w:rPr>
-        <w:t xml:space="preserve">- </w:t>
+        <w:t>D E C I M A</w:t>
+      </w:r>
+      <w:r>
+        <w:rPr>
+          <w:rFonts w:ascii="Arial" w:hAnsi="Arial" w:cs="Arial"/>
+          <w:sz w:val="22"/>
+          <w:szCs w:val="22"/>
+        </w:rPr>
+        <w:t xml:space="preserve"> - - - - - - - - - - - - -</w:t>
+      </w:r>
+      <w:r>
+        <w:rPr>
+          <w:rFonts w:ascii="Arial" w:hAnsi="Arial" w:cs="Arial"/>
+          <w:sz w:val="22"/>
+          <w:szCs w:val="22"/>
+        </w:rPr>
+        <w:t xml:space="preserve"> - - - - - - - - - - - - - - -</w:t>
+      </w:r>
+      <w:r>
+        <w:rPr>
+          <w:rFonts w:ascii="Arial" w:hAnsi="Arial" w:cs="Arial"/>
+          <w:sz w:val="22"/>
+          <w:szCs w:val="22"/>
+        </w:rPr>
+        <w:t xml:space="preserve"> </w:t>
+      </w:r>
+      <w:r>
+        <w:rPr>
+          <w:rFonts w:ascii="Arial" w:hAnsi="Arial" w:cs="Arial"/>
+          <w:sz w:val="22"/>
+          <w:szCs w:val="22"/>
+        </w:rPr>
+        <w:t xml:space="preserve">El Señor </w:t>
       </w:r>
       <w:r>
         <w:rPr>
@@ -5372,53 +5379,24 @@
           <w:bCs/>
           <w:sz w:val="22"/>
           <w:szCs w:val="22"/>
-          <w:u w:val="single"/>
-        </w:rPr>
-        <w:t>D E C I M A</w:t>
-      </w:r>
-      <w:r>
-        <w:rPr>
-          <w:rFonts w:ascii="Arial" w:hAnsi="Arial" w:cs="Arial"/>
-          <w:sz w:val="22"/>
-          <w:szCs w:val="22"/>
-        </w:rPr>
-        <w:t xml:space="preserve"> - - - - - - - - - - - - -</w:t>
-      </w:r>
-      <w:r>
-        <w:rPr>
-          <w:rFonts w:ascii="Arial" w:hAnsi="Arial" w:cs="Arial"/>
-          <w:sz w:val="22"/>
-          <w:szCs w:val="22"/>
-        </w:rPr>
-        <w:t xml:space="preserve"> - - - - - - - - - - - - - - -</w:t>
-      </w:r>
-      <w:r>
-        <w:rPr>
-          <w:rFonts w:ascii="Arial" w:hAnsi="Arial" w:cs="Arial"/>
-          <w:sz w:val="22"/>
-          <w:szCs w:val="22"/>
-        </w:rPr>
-        <w:t xml:space="preserve"> </w:t>
-      </w:r>
-      <w:r>
-        <w:rPr>
-          <w:rFonts w:ascii="Arial" w:hAnsi="Arial" w:cs="Arial"/>
-          <w:sz w:val="22"/>
-          <w:szCs w:val="22"/>
-        </w:rPr>
-        <w:t xml:space="preserve">El Señor </w:t>
-      </w:r>
-      <w:r>
-        <w:rPr>
+        </w:rPr>
+        <w:t>{{</w:t>
+      </w:r>
+      <w:proofErr w:type="spellStart"/>
+      <w:r>
+        <w:rPr>
+          <w:rStyle w:val="spellingerror"/>
           <w:rFonts w:ascii="Arial" w:hAnsi="Arial" w:cs="Arial"/>
           <w:b/>
           <w:bCs/>
-          <w:sz w:val="22"/>
-          <w:szCs w:val="22"/>
-        </w:rPr>
-        <w:t>{{</w:t>
-      </w:r>
-      <w:proofErr w:type="spellStart"/>
+          <w:color w:val="auto"/>
+          <w:sz w:val="22"/>
+          <w:szCs w:val="22"/>
+          <w:u w:val="single"/>
+        </w:rPr>
+        <w:t>comprador.nombre</w:t>
+      </w:r>
+      <w:proofErr w:type="spellEnd"/>
       <w:r>
         <w:rPr>
           <w:rStyle w:val="spellingerror"/>
@@ -5430,253 +5408,252 @@
           <w:szCs w:val="22"/>
           <w:u w:val="single"/>
         </w:rPr>
-        <w:t>comprador.nombre</w:t>
-      </w:r>
-      <w:proofErr w:type="spellEnd"/>
+        <w:t>}}</w:t>
+      </w:r>
       <w:r>
         <w:rPr>
           <w:rStyle w:val="spellingerror"/>
           <w:rFonts w:ascii="Arial" w:hAnsi="Arial" w:cs="Arial"/>
           <w:b/>
           <w:bCs/>
-          <w:color w:val="auto"/>
           <w:sz w:val="22"/>
           <w:szCs w:val="22"/>
           <w:u w:val="single"/>
         </w:rPr>
-        <w:t>}}</w:t>
-      </w:r>
-      <w:r>
-        <w:rPr>
-          <w:rStyle w:val="spellingerror"/>
+        <w:t>,</w:t>
+      </w:r>
+      <w:r>
+        <w:rPr>
+          <w:rFonts w:ascii="Arial" w:hAnsi="Arial" w:cs="Arial"/>
+          <w:sz w:val="22"/>
+          <w:szCs w:val="22"/>
+        </w:rPr>
+        <w:t xml:space="preserve"> que </w:t>
+      </w:r>
+      <w:r>
+        <w:rPr>
+          <w:rFonts w:ascii="Arial" w:hAnsi="Arial" w:cs="Arial"/>
+          <w:sz w:val="22"/>
+          <w:szCs w:val="22"/>
+        </w:rPr>
+        <w:t xml:space="preserve">acepta la presente escritura de compraventa en los términos de su redacción, dándose por recibido la totalidad </w:t>
+      </w:r>
+      <w:r>
+        <w:rPr>
+          <w:rFonts w:ascii="Arial" w:hAnsi="Arial" w:cs="Arial"/>
+          <w:sz w:val="22"/>
+          <w:szCs w:val="22"/>
+        </w:rPr>
+        <w:lastRenderedPageBreak/>
+        <w:t>del inmueble que hoy adquiere en propiedad, así como de esta escritura</w:t>
+      </w:r>
+      <w:r>
+        <w:rPr>
+          <w:rFonts w:ascii="Arial" w:hAnsi="Arial" w:cs="Arial"/>
+          <w:sz w:val="22"/>
+          <w:szCs w:val="22"/>
+        </w:rPr>
+        <w:t xml:space="preserve"> -</w:t>
+      </w:r>
+      <w:r>
+        <w:rPr>
+          <w:rFonts w:ascii="Arial" w:hAnsi="Arial" w:cs="Arial"/>
+          <w:sz w:val="22"/>
+          <w:szCs w:val="22"/>
+        </w:rPr>
+        <w:t xml:space="preserve"> -</w:t>
+      </w:r>
+      <w:r>
+        <w:rPr>
+          <w:rFonts w:ascii="Arial" w:hAnsi="Arial" w:cs="Arial"/>
+          <w:sz w:val="22"/>
+          <w:szCs w:val="22"/>
+        </w:rPr>
+        <w:t xml:space="preserve"> </w:t>
+      </w:r>
+      <w:r>
+        <w:rPr>
+          <w:rFonts w:ascii="Arial" w:hAnsi="Arial" w:cs="Arial"/>
+          <w:sz w:val="22"/>
+          <w:szCs w:val="22"/>
+        </w:rPr>
+        <w:t xml:space="preserve">- - - - </w:t>
+      </w:r>
+      <w:r>
+        <w:rPr>
+          <w:rFonts w:ascii="Arial" w:hAnsi="Arial" w:cs="Arial"/>
+          <w:sz w:val="22"/>
+          <w:szCs w:val="22"/>
+        </w:rPr>
+        <w:t xml:space="preserve">- - </w:t>
+      </w:r>
+      <w:r>
+        <w:rPr>
+          <w:rFonts w:ascii="Arial" w:hAnsi="Arial" w:cs="Arial"/>
+          <w:sz w:val="22"/>
+          <w:szCs w:val="22"/>
+        </w:rPr>
+        <w:t>- - - - -</w:t>
+      </w:r>
+      <w:r>
+        <w:rPr>
+          <w:rFonts w:ascii="Arial" w:hAnsi="Arial" w:cs="Arial"/>
+          <w:sz w:val="22"/>
+          <w:szCs w:val="22"/>
+        </w:rPr>
+        <w:t xml:space="preserve"> - - - - - - - - - - - - - - - - - - - - - - - - - - - - - - - - - - - - - - - - - - - - - - - - - - - -</w:t>
+      </w:r>
+      <w:r>
+        <w:rPr>
+          <w:rFonts w:ascii="Arial" w:hAnsi="Arial" w:cs="Arial"/>
+          <w:sz w:val="22"/>
+          <w:szCs w:val="22"/>
+        </w:rPr>
+        <w:t xml:space="preserve"> - - </w:t>
+      </w:r>
+      <w:r>
+        <w:rPr>
+          <w:rFonts w:ascii="Arial" w:hAnsi="Arial" w:cs="Arial"/>
+          <w:sz w:val="22"/>
+          <w:szCs w:val="22"/>
+        </w:rPr>
+        <w:t xml:space="preserve">- </w:t>
+      </w:r>
+      <w:r>
+        <w:rPr>
+          <w:rStyle w:val="Cuerpodeltexto3Espaciado3pto0"/>
+          <w:sz w:val="22"/>
+          <w:szCs w:val="22"/>
+          <w:lang w:val="es-MX"/>
+        </w:rPr>
+        <w:t>DATOS PERSONALES</w:t>
+      </w:r>
+      <w:r>
+        <w:rPr>
+          <w:rStyle w:val="Cuerpodeltexto3Espaciado3pto"/>
+          <w:b w:val="0"/>
+          <w:sz w:val="22"/>
+          <w:szCs w:val="22"/>
+          <w:lang w:val="es-MX"/>
+        </w:rPr>
+        <w:t>--------------</w:t>
+      </w:r>
+      <w:r>
+        <w:rPr>
+          <w:rStyle w:val="Cuerpodeltexto3Espaciado3pto"/>
+          <w:b w:val="0"/>
+          <w:sz w:val="22"/>
+          <w:szCs w:val="22"/>
+          <w:lang w:val="es-MX"/>
+        </w:rPr>
+        <w:t>---</w:t>
+      </w:r>
+      <w:r>
+        <w:rPr>
+          <w:rStyle w:val="Cuerpodeltexto3Espaciado3pto"/>
+          <w:b w:val="0"/>
+          <w:sz w:val="22"/>
+          <w:szCs w:val="22"/>
+          <w:lang w:val="es-MX"/>
+        </w:rPr>
+        <w:t>-</w:t>
+      </w:r>
+      <w:r>
+        <w:rPr>
+          <w:rFonts w:ascii="Arial" w:hAnsi="Arial" w:cs="Arial"/>
+          <w:sz w:val="22"/>
+          <w:szCs w:val="22"/>
+        </w:rPr>
+        <w:t>Advertidos ampliamente de las sanciones en que incurren las personas que se producen con falsedad ante Notario Público en los términos del Artículo 108 ciento ocho, de la Ley del Notariado en vigor, los contratantes a sus generales me manifestaron</w:t>
+      </w:r>
+      <w:r>
+        <w:rPr>
+          <w:rFonts w:ascii="Arial" w:hAnsi="Arial" w:cs="Arial"/>
+          <w:sz w:val="22"/>
+          <w:szCs w:val="22"/>
+        </w:rPr>
+        <w:t>:</w:t>
+      </w:r>
+      <w:r>
+        <w:rPr>
+          <w:rFonts w:ascii="Arial" w:hAnsi="Arial" w:cs="Arial"/>
+          <w:sz w:val="22"/>
+          <w:szCs w:val="22"/>
+        </w:rPr>
+        <w:t xml:space="preserve"> - - - - - - - - - - - - - - - - - - - - - - - - - - - - - - - - - - - - </w:t>
+      </w:r>
+      <w:r>
+        <w:rPr>
+          <w:rFonts w:ascii="Arial" w:hAnsi="Arial" w:cs="Arial"/>
+          <w:sz w:val="22"/>
+          <w:szCs w:val="22"/>
+        </w:rPr>
+        <w:t xml:space="preserve">- </w:t>
+      </w:r>
+      <w:r>
+        <w:rPr>
+          <w:rFonts w:ascii="Arial" w:hAnsi="Arial" w:cs="Arial"/>
+          <w:sz w:val="22"/>
+          <w:szCs w:val="22"/>
+        </w:rPr>
+        <w:t>- - - - - - - -</w:t>
+      </w:r>
+      <w:r>
+        <w:rPr>
+          <w:rFonts w:ascii="Arial" w:hAnsi="Arial" w:cs="Arial"/>
+          <w:sz w:val="22"/>
+          <w:szCs w:val="22"/>
+        </w:rPr>
+        <w:t xml:space="preserve"> </w:t>
+      </w:r>
+      <w:bookmarkStart w:id="0" w:name="_Hlk171069379"/>
+      <w:r>
+        <w:rPr>
+          <w:rFonts w:ascii="Arial" w:hAnsi="Arial" w:cs="Arial"/>
+          <w:sz w:val="22"/>
+          <w:szCs w:val="22"/>
+        </w:rPr>
+        <w:t xml:space="preserve">- - - a).- </w:t>
+      </w:r>
+      <w:r>
+        <w:rPr>
+          <w:sz w:val="22"/>
+          <w:szCs w:val="22"/>
+        </w:rPr>
+        <w:t xml:space="preserve"> </w:t>
+      </w:r>
+      <w:r>
+        <w:rPr>
+          <w:rFonts w:ascii="Arial" w:hAnsi="Arial" w:cs="Arial"/>
+          <w:sz w:val="22"/>
+          <w:szCs w:val="22"/>
+        </w:rPr>
+        <w:t xml:space="preserve">El señor </w:t>
+      </w:r>
+      <w:r>
+        <w:rPr>
           <w:rFonts w:ascii="Arial" w:hAnsi="Arial" w:cs="Arial"/>
           <w:b/>
           <w:bCs/>
           <w:sz w:val="22"/>
           <w:szCs w:val="22"/>
-          <w:u w:val="single"/>
-        </w:rPr>
-        <w:t>,</w:t>
-      </w:r>
-      <w:r>
-        <w:rPr>
-          <w:rFonts w:ascii="Arial" w:hAnsi="Arial" w:cs="Arial"/>
-          <w:sz w:val="22"/>
-          <w:szCs w:val="22"/>
-        </w:rPr>
-        <w:t xml:space="preserve"> que </w:t>
-      </w:r>
-      <w:r>
-        <w:rPr>
-          <w:rFonts w:ascii="Arial" w:hAnsi="Arial" w:cs="Arial"/>
-          <w:sz w:val="22"/>
-          <w:szCs w:val="22"/>
-        </w:rPr>
-        <w:t xml:space="preserve">acepta la presente escritura de compraventa en los términos de su redacción, dándose por recibido la totalidad </w:t>
-      </w:r>
-      <w:r>
-        <w:rPr>
-          <w:rFonts w:ascii="Arial" w:hAnsi="Arial" w:cs="Arial"/>
-          <w:sz w:val="22"/>
-          <w:szCs w:val="22"/>
-        </w:rPr>
-        <w:lastRenderedPageBreak/>
-        <w:t>del inmueble que hoy adquiere en propiedad, así como de esta escritura</w:t>
-      </w:r>
-      <w:r>
-        <w:rPr>
-          <w:rFonts w:ascii="Arial" w:hAnsi="Arial" w:cs="Arial"/>
-          <w:sz w:val="22"/>
-          <w:szCs w:val="22"/>
-        </w:rPr>
-        <w:t xml:space="preserve"> -</w:t>
-      </w:r>
-      <w:r>
-        <w:rPr>
-          <w:rFonts w:ascii="Arial" w:hAnsi="Arial" w:cs="Arial"/>
-          <w:sz w:val="22"/>
-          <w:szCs w:val="22"/>
-        </w:rPr>
-        <w:t xml:space="preserve"> -</w:t>
-      </w:r>
-      <w:r>
-        <w:rPr>
-          <w:rFonts w:ascii="Arial" w:hAnsi="Arial" w:cs="Arial"/>
-          <w:sz w:val="22"/>
-          <w:szCs w:val="22"/>
-        </w:rPr>
-        <w:t xml:space="preserve"> </w:t>
-      </w:r>
-      <w:r>
-        <w:rPr>
-          <w:rFonts w:ascii="Arial" w:hAnsi="Arial" w:cs="Arial"/>
-          <w:sz w:val="22"/>
-          <w:szCs w:val="22"/>
-        </w:rPr>
-        <w:t xml:space="preserve">- - - - </w:t>
-      </w:r>
-      <w:r>
-        <w:rPr>
-          <w:rFonts w:ascii="Arial" w:hAnsi="Arial" w:cs="Arial"/>
-          <w:sz w:val="22"/>
-          <w:szCs w:val="22"/>
-        </w:rPr>
-        <w:t xml:space="preserve">- - </w:t>
-      </w:r>
-      <w:r>
-        <w:rPr>
-          <w:rFonts w:ascii="Arial" w:hAnsi="Arial" w:cs="Arial"/>
-          <w:sz w:val="22"/>
-          <w:szCs w:val="22"/>
-        </w:rPr>
-        <w:t>- - - - -</w:t>
-      </w:r>
-      <w:r>
-        <w:rPr>
-          <w:rFonts w:ascii="Arial" w:hAnsi="Arial" w:cs="Arial"/>
-          <w:sz w:val="22"/>
-          <w:szCs w:val="22"/>
-        </w:rPr>
-        <w:t xml:space="preserve"> - - - - - - - - - - - - - - - - - - - - - - - - - - - - - - - - - - - - - - - - - - - - - - - - - - - -</w:t>
-      </w:r>
-      <w:r>
-        <w:rPr>
-          <w:rFonts w:ascii="Arial" w:hAnsi="Arial" w:cs="Arial"/>
-          <w:sz w:val="22"/>
-          <w:szCs w:val="22"/>
-        </w:rPr>
-        <w:t xml:space="preserve"> - - </w:t>
-      </w:r>
-      <w:r>
-        <w:rPr>
-          <w:rFonts w:ascii="Arial" w:hAnsi="Arial" w:cs="Arial"/>
-          <w:sz w:val="22"/>
-          <w:szCs w:val="22"/>
-        </w:rPr>
-        <w:t xml:space="preserve">- </w:t>
-      </w:r>
-      <w:r>
-        <w:rPr>
-          <w:rStyle w:val="Cuerpodeltexto3Espaciado3pto0"/>
-          <w:sz w:val="22"/>
-          <w:szCs w:val="22"/>
-          <w:lang w:val="es-MX"/>
-        </w:rPr>
-        <w:t>DATOS PERSONALES</w:t>
-      </w:r>
-      <w:r>
-        <w:rPr>
-          <w:rStyle w:val="Cuerpodeltexto3Espaciado3pto"/>
-          <w:b w:val="0"/>
-          <w:sz w:val="22"/>
-          <w:szCs w:val="22"/>
-          <w:lang w:val="es-MX"/>
-        </w:rPr>
-        <w:t>--------------</w:t>
-      </w:r>
-      <w:r>
-        <w:rPr>
-          <w:rStyle w:val="Cuerpodeltexto3Espaciado3pto"/>
-          <w:b w:val="0"/>
-          <w:sz w:val="22"/>
-          <w:szCs w:val="22"/>
-          <w:lang w:val="es-MX"/>
-        </w:rPr>
-        <w:t>---</w:t>
-      </w:r>
-      <w:r>
-        <w:rPr>
-          <w:rStyle w:val="Cuerpodeltexto3Espaciado3pto"/>
-          <w:b w:val="0"/>
-          <w:sz w:val="22"/>
-          <w:szCs w:val="22"/>
-          <w:lang w:val="es-MX"/>
-        </w:rPr>
-        <w:t>-</w:t>
-      </w:r>
-      <w:r>
-        <w:rPr>
-          <w:rFonts w:ascii="Arial" w:hAnsi="Arial" w:cs="Arial"/>
-          <w:sz w:val="22"/>
-          <w:szCs w:val="22"/>
-        </w:rPr>
-        <w:t>Advertidos ampliamente de las sanciones en que incurren las personas que se producen con falsedad ante Notario Público en los términos del Artículo 108 ciento ocho, de la Ley del Notariado en vigor, los contratantes a sus generales me manifestaron</w:t>
-      </w:r>
-      <w:r>
-        <w:rPr>
-          <w:rFonts w:ascii="Arial" w:hAnsi="Arial" w:cs="Arial"/>
-          <w:sz w:val="22"/>
-          <w:szCs w:val="22"/>
-        </w:rPr>
-        <w:t>:</w:t>
-      </w:r>
-      <w:r>
-        <w:rPr>
-          <w:rFonts w:ascii="Arial" w:hAnsi="Arial" w:cs="Arial"/>
-          <w:sz w:val="22"/>
-          <w:szCs w:val="22"/>
-        </w:rPr>
-        <w:t xml:space="preserve"> - - - - - - - - - - - - - - - - - - - - - - - - - - - - - - - - - - - - </w:t>
-      </w:r>
-      <w:r>
-        <w:rPr>
-          <w:rFonts w:ascii="Arial" w:hAnsi="Arial" w:cs="Arial"/>
-          <w:sz w:val="22"/>
-          <w:szCs w:val="22"/>
-        </w:rPr>
-        <w:t xml:space="preserve">- </w:t>
-      </w:r>
-      <w:r>
-        <w:rPr>
-          <w:rFonts w:ascii="Arial" w:hAnsi="Arial" w:cs="Arial"/>
-          <w:sz w:val="22"/>
-          <w:szCs w:val="22"/>
-        </w:rPr>
-        <w:t>- - - - - - - -</w:t>
-      </w:r>
-      <w:r>
-        <w:rPr>
-          <w:rFonts w:ascii="Arial" w:hAnsi="Arial" w:cs="Arial"/>
-          <w:sz w:val="22"/>
-          <w:szCs w:val="22"/>
-        </w:rPr>
-        <w:t xml:space="preserve"> </w:t>
-      </w:r>
-      <w:bookmarkStart w:id="0" w:name="_Hlk171069379"/>
-      <w:r>
-        <w:rPr>
-          <w:rFonts w:ascii="Arial" w:hAnsi="Arial" w:cs="Arial"/>
-          <w:sz w:val="22"/>
-          <w:szCs w:val="22"/>
-        </w:rPr>
-        <w:t xml:space="preserve">- - - a).- </w:t>
-      </w:r>
-      <w:r>
-        <w:rPr>
-          <w:sz w:val="22"/>
-          <w:szCs w:val="22"/>
-        </w:rPr>
-        <w:t xml:space="preserve"> </w:t>
-      </w:r>
-      <w:r>
-        <w:rPr>
-          <w:rFonts w:ascii="Arial" w:hAnsi="Arial" w:cs="Arial"/>
-          <w:sz w:val="22"/>
-          <w:szCs w:val="22"/>
-        </w:rPr>
-        <w:t xml:space="preserve">El señor </w:t>
-      </w:r>
-      <w:r>
-        <w:rPr>
+        </w:rPr>
+        <w:t>{{</w:t>
+      </w:r>
+      <w:proofErr w:type="spellStart"/>
+      <w:r>
+        <w:rPr>
+          <w:rStyle w:val="spellingerror"/>
           <w:rFonts w:ascii="Arial" w:hAnsi="Arial" w:cs="Arial"/>
           <w:b/>
           <w:bCs/>
           <w:sz w:val="22"/>
           <w:szCs w:val="22"/>
-        </w:rPr>
-        <w:t>{{</w:t>
-      </w:r>
-      <w:proofErr w:type="spellStart"/>
+          <w:u w:val="single"/>
+        </w:rPr>
+        <w:t>vendedor.nombre</w:t>
+      </w:r>
+      <w:proofErr w:type="spellEnd"/>
       <w:r>
         <w:rPr>
           <w:rStyle w:val="spellingerror"/>
@@ -5687,466 +5664,474 @@
           <w:szCs w:val="22"/>
           <w:u w:val="single"/>
         </w:rPr>
-        <w:t>vendedor.nombre</w:t>
+        <w:t>}}</w:t>
+      </w:r>
+      <w:r>
+        <w:rPr>
+          <w:rFonts w:ascii="Arial" w:hAnsi="Arial" w:cs="Arial"/>
+          <w:b/>
+          <w:sz w:val="22"/>
+          <w:szCs w:val="22"/>
+          <w:u w:val="single"/>
+        </w:rPr>
+        <w:t>,</w:t>
+      </w:r>
+      <w:r>
+        <w:rPr>
+          <w:rStyle w:val="apple-converted-space"/>
+          <w:rFonts w:ascii="Arial" w:hAnsi="Arial" w:cs="Arial"/>
+          <w:sz w:val="22"/>
+          <w:szCs w:val="22"/>
+        </w:rPr>
+        <w:t xml:space="preserve"> ser originario</w:t>
+      </w:r>
+      <w:r>
+        <w:rPr>
+          <w:rStyle w:val="apple-converted-space"/>
+          <w:rFonts w:ascii="Arial" w:hAnsi="Arial" w:cs="Arial"/>
+          <w:sz w:val="22"/>
+          <w:szCs w:val="22"/>
+        </w:rPr>
+        <w:t xml:space="preserve"> de </w:t>
+      </w:r>
+      <w:r>
+        <w:rPr>
+          <w:rStyle w:val="apple-converted-space"/>
+          <w:rFonts w:ascii="Arial" w:hAnsi="Arial" w:cs="Arial"/>
+          <w:sz w:val="22"/>
+          <w:szCs w:val="22"/>
+        </w:rPr>
+        <w:t>{{</w:t>
+      </w:r>
+      <w:proofErr w:type="spellStart"/>
+      <w:r>
+        <w:rPr>
+          <w:rStyle w:val="apple-converted-space"/>
+          <w:rFonts w:ascii="Arial" w:hAnsi="Arial" w:cs="Arial"/>
+          <w:sz w:val="22"/>
+          <w:szCs w:val="22"/>
+        </w:rPr>
+        <w:t>vendedor.originario</w:t>
       </w:r>
       <w:proofErr w:type="spellEnd"/>
       <w:r>
         <w:rPr>
-          <w:rStyle w:val="spellingerror"/>
+          <w:rStyle w:val="apple-converted-space"/>
+          <w:rFonts w:ascii="Arial" w:hAnsi="Arial" w:cs="Arial"/>
+          <w:sz w:val="22"/>
+          <w:szCs w:val="22"/>
+        </w:rPr>
+        <w:t>}}</w:t>
+      </w:r>
+      <w:r>
+        <w:rPr>
+          <w:rStyle w:val="apple-converted-space"/>
+          <w:rFonts w:ascii="Arial" w:hAnsi="Arial" w:cs="Arial"/>
+          <w:sz w:val="22"/>
+          <w:szCs w:val="22"/>
+        </w:rPr>
+        <w:t xml:space="preserve">, Estado de </w:t>
+      </w:r>
+      <w:r>
+        <w:rPr>
+          <w:rStyle w:val="apple-converted-space"/>
+          <w:rFonts w:ascii="Arial" w:hAnsi="Arial" w:cs="Arial"/>
+          <w:sz w:val="22"/>
+          <w:szCs w:val="22"/>
+        </w:rPr>
+        <w:t>Hidalgo</w:t>
+      </w:r>
+      <w:r>
+        <w:rPr>
+          <w:rStyle w:val="apple-converted-space"/>
+          <w:rFonts w:ascii="Arial" w:hAnsi="Arial" w:cs="Arial"/>
+          <w:sz w:val="22"/>
+          <w:szCs w:val="22"/>
+        </w:rPr>
+        <w:t xml:space="preserve"> y vecino</w:t>
+      </w:r>
+      <w:r>
+        <w:rPr>
+          <w:rStyle w:val="apple-converted-space"/>
+          <w:rFonts w:ascii="Arial" w:hAnsi="Arial" w:cs="Arial"/>
+          <w:sz w:val="22"/>
+          <w:szCs w:val="22"/>
+        </w:rPr>
+        <w:t xml:space="preserve"> de </w:t>
+      </w:r>
+      <w:r>
+        <w:rPr>
+          <w:rStyle w:val="apple-converted-space"/>
+          <w:rFonts w:ascii="Arial" w:hAnsi="Arial" w:cs="Arial"/>
+          <w:sz w:val="22"/>
+          <w:szCs w:val="22"/>
+        </w:rPr>
+        <w:t>{{</w:t>
+      </w:r>
+      <w:proofErr w:type="spellStart"/>
+      <w:r>
+        <w:rPr>
+          <w:rStyle w:val="apple-converted-space"/>
+          <w:rFonts w:ascii="Arial" w:hAnsi="Arial" w:cs="Arial"/>
+          <w:sz w:val="22"/>
+          <w:szCs w:val="22"/>
+        </w:rPr>
+        <w:t>vendedor.vecino</w:t>
+      </w:r>
+      <w:proofErr w:type="spellEnd"/>
+      <w:r>
+        <w:rPr>
+          <w:rStyle w:val="apple-converted-space"/>
+          <w:rFonts w:ascii="Arial" w:hAnsi="Arial" w:cs="Arial"/>
+          <w:sz w:val="22"/>
+          <w:szCs w:val="22"/>
+        </w:rPr>
+        <w:t>}}</w:t>
+      </w:r>
+      <w:r>
+        <w:rPr>
+          <w:rStyle w:val="apple-converted-space"/>
+          <w:rFonts w:ascii="Arial" w:hAnsi="Arial" w:cs="Arial"/>
+          <w:sz w:val="22"/>
+          <w:szCs w:val="22"/>
+        </w:rPr>
+        <w:t>, E</w:t>
+      </w:r>
+      <w:r>
+        <w:rPr>
+          <w:rStyle w:val="apple-converted-space"/>
+          <w:rFonts w:ascii="Arial" w:hAnsi="Arial" w:cs="Arial"/>
+          <w:sz w:val="22"/>
+          <w:szCs w:val="22"/>
+        </w:rPr>
+        <w:t xml:space="preserve">stado de Hidalgo, con domicilio en </w:t>
+      </w:r>
+      <w:r>
+        <w:rPr>
+          <w:rStyle w:val="apple-converted-space"/>
+          <w:rFonts w:ascii="Arial" w:hAnsi="Arial" w:cs="Arial"/>
+          <w:sz w:val="22"/>
+          <w:szCs w:val="22"/>
+        </w:rPr>
+        <w:t>{{</w:t>
+      </w:r>
+      <w:proofErr w:type="spellStart"/>
+      <w:r>
+        <w:rPr>
+          <w:rStyle w:val="apple-converted-space"/>
+          <w:rFonts w:ascii="Arial" w:hAnsi="Arial" w:cs="Arial"/>
+          <w:sz w:val="22"/>
+          <w:szCs w:val="22"/>
+        </w:rPr>
+        <w:t>vendedor.domicilio</w:t>
+      </w:r>
+      <w:proofErr w:type="spellEnd"/>
+      <w:r>
+        <w:rPr>
+          <w:rStyle w:val="apple-converted-space"/>
+          <w:rFonts w:ascii="Arial" w:hAnsi="Arial" w:cs="Arial"/>
+          <w:sz w:val="22"/>
+          <w:szCs w:val="22"/>
+        </w:rPr>
+        <w:t>}}</w:t>
+      </w:r>
+      <w:r>
+        <w:rPr>
+          <w:rStyle w:val="apple-converted-space"/>
+          <w:rFonts w:ascii="Arial" w:hAnsi="Arial" w:cs="Arial"/>
+          <w:sz w:val="22"/>
+          <w:szCs w:val="22"/>
+        </w:rPr>
+        <w:t xml:space="preserve">, </w:t>
+      </w:r>
+      <w:r>
+        <w:rPr>
+          <w:rStyle w:val="apple-converted-space"/>
+          <w:rFonts w:ascii="Arial" w:hAnsi="Arial" w:cs="Arial"/>
+          <w:sz w:val="22"/>
+          <w:szCs w:val="22"/>
+        </w:rPr>
+        <w:t xml:space="preserve">Código Postal </w:t>
+      </w:r>
+      <w:r>
+        <w:rPr>
+          <w:rStyle w:val="apple-converted-space"/>
+          <w:rFonts w:ascii="Arial" w:hAnsi="Arial" w:cs="Arial"/>
+          <w:sz w:val="22"/>
+          <w:szCs w:val="22"/>
+        </w:rPr>
+        <w:t>{{</w:t>
+      </w:r>
+      <w:proofErr w:type="spellStart"/>
+      <w:r>
+        <w:rPr>
+          <w:rStyle w:val="apple-converted-space"/>
+          <w:rFonts w:ascii="Arial" w:hAnsi="Arial" w:cs="Arial"/>
+          <w:sz w:val="22"/>
+          <w:szCs w:val="22"/>
+        </w:rPr>
+        <w:t>vendedor.codigo_postal</w:t>
+      </w:r>
+      <w:proofErr w:type="spellEnd"/>
+      <w:r>
+        <w:rPr>
+          <w:rStyle w:val="apple-converted-space"/>
+          <w:rFonts w:ascii="Arial" w:hAnsi="Arial" w:cs="Arial"/>
+          <w:sz w:val="22"/>
+          <w:szCs w:val="22"/>
+        </w:rPr>
+        <w:t>}}</w:t>
+      </w:r>
+      <w:r>
+        <w:rPr>
+          <w:rStyle w:val="apple-converted-space"/>
+          <w:rFonts w:ascii="Arial" w:hAnsi="Arial" w:cs="Arial"/>
+          <w:sz w:val="22"/>
+          <w:szCs w:val="22"/>
+        </w:rPr>
+        <w:t xml:space="preserve">, con fecha de nacimiento el día </w:t>
+      </w:r>
+      <w:r>
+        <w:rPr>
+          <w:rStyle w:val="apple-converted-space"/>
+          <w:rFonts w:ascii="Arial" w:hAnsi="Arial" w:cs="Arial"/>
+          <w:sz w:val="22"/>
+          <w:szCs w:val="22"/>
+        </w:rPr>
+        <w:t>{{</w:t>
+      </w:r>
+      <w:proofErr w:type="spellStart"/>
+      <w:r>
+        <w:rPr>
+          <w:rFonts w:ascii="Arial" w:hAnsi="Arial" w:cs="Arial"/>
+          <w:sz w:val="22"/>
+          <w:szCs w:val="22"/>
+        </w:rPr>
+        <w:t>vendedor.fecha_nacimiento</w:t>
+      </w:r>
+      <w:proofErr w:type="spellEnd"/>
+      <w:r>
+        <w:rPr>
+          <w:rStyle w:val="apple-converted-space"/>
+          <w:rFonts w:ascii="Arial" w:hAnsi="Arial" w:cs="Arial"/>
+          <w:sz w:val="22"/>
+          <w:szCs w:val="22"/>
+        </w:rPr>
+        <w:t>}}</w:t>
+      </w:r>
+      <w:r>
+        <w:rPr>
+          <w:rStyle w:val="apple-converted-space"/>
+          <w:rFonts w:ascii="Arial" w:hAnsi="Arial" w:cs="Arial"/>
+          <w:sz w:val="22"/>
+          <w:szCs w:val="22"/>
+        </w:rPr>
+        <w:t xml:space="preserve"> (</w:t>
+      </w:r>
+      <w:r>
+        <w:rPr>
+          <w:rStyle w:val="apple-converted-space"/>
+          <w:rFonts w:ascii="Arial" w:hAnsi="Arial" w:cs="Arial"/>
+          <w:sz w:val="22"/>
+          <w:szCs w:val="22"/>
+        </w:rPr>
+        <w:t>{{</w:t>
+      </w:r>
+      <w:proofErr w:type="spellStart"/>
+      <w:r>
+        <w:rPr>
+          <w:rFonts w:ascii="Arial" w:hAnsi="Arial" w:cs="Arial"/>
+          <w:sz w:val="22"/>
+          <w:szCs w:val="22"/>
+        </w:rPr>
+        <w:t>vendedor.anio_nacimiento_letra</w:t>
+      </w:r>
+      <w:proofErr w:type="spellEnd"/>
+      <w:r>
+        <w:rPr>
+          <w:rStyle w:val="apple-converted-space"/>
+          <w:rFonts w:ascii="Arial" w:hAnsi="Arial" w:cs="Arial"/>
+          <w:sz w:val="22"/>
+          <w:szCs w:val="22"/>
+        </w:rPr>
+        <w:t>}}</w:t>
+      </w:r>
+      <w:r>
+        <w:rPr>
+          <w:rStyle w:val="apple-converted-space"/>
+          <w:rFonts w:ascii="Arial" w:hAnsi="Arial" w:cs="Arial"/>
+          <w:sz w:val="22"/>
+          <w:szCs w:val="22"/>
+        </w:rPr>
+        <w:t>) de</w:t>
+      </w:r>
+      <w:r>
+        <w:rPr>
+          <w:rStyle w:val="apple-converted-space"/>
+          <w:rFonts w:ascii="Arial" w:hAnsi="Arial" w:cs="Arial"/>
+          <w:sz w:val="22"/>
+          <w:szCs w:val="22"/>
+        </w:rPr>
+        <w:t xml:space="preserve"> </w:t>
+      </w:r>
+      <w:r>
+        <w:rPr>
+          <w:rStyle w:val="apple-converted-space"/>
+          <w:rFonts w:ascii="Arial" w:hAnsi="Arial" w:cs="Arial"/>
+          <w:sz w:val="22"/>
+          <w:szCs w:val="22"/>
+        </w:rPr>
+        <w:t>{{</w:t>
+      </w:r>
+      <w:proofErr w:type="spellStart"/>
+      <w:r>
+        <w:rPr>
+          <w:rFonts w:ascii="Arial" w:hAnsi="Arial" w:cs="Arial"/>
+          <w:sz w:val="22"/>
+          <w:szCs w:val="22"/>
+        </w:rPr>
+        <w:t>vendedor.edad_numero</w:t>
+      </w:r>
+      <w:proofErr w:type="spellEnd"/>
+      <w:r>
+        <w:rPr>
+          <w:rStyle w:val="apple-converted-space"/>
+          <w:rFonts w:ascii="Arial" w:hAnsi="Arial" w:cs="Arial"/>
+          <w:sz w:val="22"/>
+          <w:szCs w:val="22"/>
+        </w:rPr>
+        <w:t>}}</w:t>
+      </w:r>
+      <w:r>
+        <w:rPr>
+          <w:rStyle w:val="apple-converted-space"/>
+          <w:rFonts w:ascii="Arial" w:hAnsi="Arial" w:cs="Arial"/>
+          <w:sz w:val="22"/>
+          <w:szCs w:val="22"/>
+        </w:rPr>
+        <w:t xml:space="preserve"> </w:t>
+      </w:r>
+      <w:r>
+        <w:rPr>
+          <w:rStyle w:val="apple-converted-space"/>
+          <w:rFonts w:ascii="Arial" w:hAnsi="Arial" w:cs="Arial"/>
+          <w:sz w:val="22"/>
+          <w:szCs w:val="22"/>
+        </w:rPr>
+        <w:t>({{</w:t>
+      </w:r>
+      <w:proofErr w:type="spellStart"/>
+      <w:r>
+        <w:rPr>
+          <w:rFonts w:ascii="Arial" w:hAnsi="Arial" w:cs="Arial"/>
+          <w:sz w:val="22"/>
+          <w:szCs w:val="22"/>
+        </w:rPr>
+        <w:t>vendedor.edad_letra</w:t>
+      </w:r>
+      <w:proofErr w:type="spellEnd"/>
+      <w:r>
+        <w:rPr>
+          <w:rStyle w:val="apple-converted-space"/>
+          <w:rFonts w:ascii="Arial" w:hAnsi="Arial" w:cs="Arial"/>
+          <w:sz w:val="22"/>
+          <w:szCs w:val="22"/>
+        </w:rPr>
+        <w:t xml:space="preserve">}}) </w:t>
+      </w:r>
+      <w:r>
+        <w:rPr>
+          <w:rStyle w:val="apple-converted-space"/>
+          <w:rFonts w:ascii="Arial" w:hAnsi="Arial" w:cs="Arial"/>
+          <w:sz w:val="22"/>
+          <w:szCs w:val="22"/>
+        </w:rPr>
+        <w:t xml:space="preserve">años de edad, </w:t>
+      </w:r>
+      <w:r>
+        <w:rPr>
+          <w:rStyle w:val="apple-converted-space"/>
+          <w:rFonts w:ascii="Arial" w:hAnsi="Arial" w:cs="Arial"/>
+          <w:sz w:val="22"/>
+          <w:szCs w:val="22"/>
+        </w:rPr>
+        <w:t>{{</w:t>
+      </w:r>
+      <w:proofErr w:type="spellStart"/>
+      <w:r>
+        <w:rPr>
+          <w:rFonts w:ascii="Arial" w:hAnsi="Arial" w:cs="Arial"/>
+          <w:sz w:val="22"/>
+          <w:szCs w:val="22"/>
+        </w:rPr>
+        <w:t>vendedor.estado_civil</w:t>
+      </w:r>
+      <w:proofErr w:type="spellEnd"/>
+      <w:r>
+        <w:rPr>
+          <w:rStyle w:val="apple-converted-space"/>
+          <w:rFonts w:ascii="Arial" w:hAnsi="Arial" w:cs="Arial"/>
+          <w:sz w:val="22"/>
+          <w:szCs w:val="22"/>
+        </w:rPr>
+        <w:t>}}</w:t>
+      </w:r>
+      <w:r>
+        <w:rPr>
+          <w:rStyle w:val="apple-converted-space"/>
+          <w:rFonts w:ascii="Arial" w:hAnsi="Arial" w:cs="Arial"/>
+          <w:sz w:val="22"/>
+          <w:szCs w:val="22"/>
+        </w:rPr>
+        <w:t xml:space="preserve">, de ocupación </w:t>
+      </w:r>
+      <w:r>
+        <w:rPr>
+          <w:rStyle w:val="apple-converted-space"/>
+          <w:rFonts w:ascii="Arial" w:hAnsi="Arial" w:cs="Arial"/>
+          <w:sz w:val="22"/>
+          <w:szCs w:val="22"/>
+        </w:rPr>
+        <w:t>{{</w:t>
+      </w:r>
+      <w:proofErr w:type="spellStart"/>
+      <w:r>
+        <w:rPr>
+          <w:rFonts w:ascii="Arial" w:hAnsi="Arial" w:cs="Arial"/>
+          <w:sz w:val="22"/>
+          <w:szCs w:val="22"/>
+        </w:rPr>
+        <w:t>vendedor.ocupacion</w:t>
+      </w:r>
+      <w:proofErr w:type="spellEnd"/>
+      <w:r>
+        <w:rPr>
+          <w:rStyle w:val="apple-converted-space"/>
+          <w:rFonts w:ascii="Arial" w:hAnsi="Arial" w:cs="Arial"/>
+          <w:sz w:val="22"/>
+          <w:szCs w:val="22"/>
+        </w:rPr>
+        <w:t>}}</w:t>
+      </w:r>
+      <w:r>
+        <w:rPr>
+          <w:rStyle w:val="apple-converted-space"/>
+          <w:rFonts w:ascii="Arial" w:hAnsi="Arial" w:cs="Arial"/>
+          <w:sz w:val="22"/>
+          <w:szCs w:val="22"/>
+        </w:rPr>
+        <w:t xml:space="preserve">, con Registro Federal de Contribuyentes número </w:t>
+      </w:r>
+      <w:r>
+        <w:rPr>
+          <w:rStyle w:val="apple-converted-space"/>
           <w:rFonts w:ascii="Arial" w:hAnsi="Arial" w:cs="Arial"/>
           <w:b/>
           <w:bCs/>
           <w:sz w:val="22"/>
           <w:szCs w:val="22"/>
-          <w:u w:val="single"/>
-        </w:rPr>
-        <w:t>}}</w:t>
-      </w:r>
-      <w:r>
-        <w:rPr>
-          <w:rFonts w:ascii="Arial" w:hAnsi="Arial" w:cs="Arial"/>
-          <w:b/>
-          <w:sz w:val="22"/>
-          <w:szCs w:val="22"/>
-          <w:u w:val="single"/>
-        </w:rPr>
-        <w:t>,</w:t>
-      </w:r>
-      <w:r>
-        <w:rPr>
-          <w:rStyle w:val="apple-converted-space"/>
-          <w:rFonts w:ascii="Arial" w:hAnsi="Arial" w:cs="Arial"/>
-          <w:sz w:val="22"/>
-          <w:szCs w:val="22"/>
-        </w:rPr>
-        <w:t xml:space="preserve"> ser originario</w:t>
-      </w:r>
-      <w:r>
-        <w:rPr>
-          <w:rStyle w:val="apple-converted-space"/>
-          <w:rFonts w:ascii="Arial" w:hAnsi="Arial" w:cs="Arial"/>
-          <w:sz w:val="22"/>
-          <w:szCs w:val="22"/>
-        </w:rPr>
-        <w:t xml:space="preserve"> de </w:t>
-      </w:r>
-      <w:r>
-        <w:rPr>
-          <w:rStyle w:val="apple-converted-space"/>
-          <w:rFonts w:ascii="Arial" w:hAnsi="Arial" w:cs="Arial"/>
-          <w:sz w:val="22"/>
-          <w:szCs w:val="22"/>
-        </w:rPr>
-        <w:t>Tepeapulco</w:t>
-      </w:r>
-      <w:r>
-        <w:rPr>
-          <w:rStyle w:val="apple-converted-space"/>
-          <w:rFonts w:ascii="Arial" w:hAnsi="Arial" w:cs="Arial"/>
-          <w:sz w:val="22"/>
-          <w:szCs w:val="22"/>
-        </w:rPr>
-        <w:t xml:space="preserve">, Estado de </w:t>
-      </w:r>
-      <w:r>
-        <w:rPr>
-          <w:rStyle w:val="apple-converted-space"/>
-          <w:rFonts w:ascii="Arial" w:hAnsi="Arial" w:cs="Arial"/>
-          <w:sz w:val="22"/>
-          <w:szCs w:val="22"/>
-        </w:rPr>
-        <w:t>Hidalgo</w:t>
-      </w:r>
-      <w:r>
-        <w:rPr>
-          <w:rStyle w:val="apple-converted-space"/>
-          <w:rFonts w:ascii="Arial" w:hAnsi="Arial" w:cs="Arial"/>
-          <w:sz w:val="22"/>
-          <w:szCs w:val="22"/>
-        </w:rPr>
-        <w:t xml:space="preserve"> y vecino</w:t>
-      </w:r>
-      <w:r>
-        <w:rPr>
-          <w:rStyle w:val="apple-converted-space"/>
-          <w:rFonts w:ascii="Arial" w:hAnsi="Arial" w:cs="Arial"/>
-          <w:sz w:val="22"/>
-          <w:szCs w:val="22"/>
-        </w:rPr>
-        <w:t xml:space="preserve"> de </w:t>
-      </w:r>
-      <w:r>
-        <w:rPr>
-          <w:rStyle w:val="apple-converted-space"/>
-          <w:rFonts w:ascii="Arial" w:hAnsi="Arial" w:cs="Arial"/>
-          <w:sz w:val="22"/>
-          <w:szCs w:val="22"/>
-        </w:rPr>
-        <w:t>Pachuca de Soto, E</w:t>
-      </w:r>
-      <w:r>
-        <w:rPr>
-          <w:rStyle w:val="apple-converted-space"/>
-          <w:rFonts w:ascii="Arial" w:hAnsi="Arial" w:cs="Arial"/>
-          <w:sz w:val="22"/>
-          <w:szCs w:val="22"/>
-        </w:rPr>
-        <w:t xml:space="preserve">stado de Hidalgo, con domicilio en la </w:t>
-      </w:r>
-      <w:r>
-        <w:rPr>
-          <w:rStyle w:val="apple-converted-space"/>
-          <w:rFonts w:ascii="Arial" w:hAnsi="Arial" w:cs="Arial"/>
-          <w:sz w:val="22"/>
-          <w:szCs w:val="22"/>
-        </w:rPr>
-        <w:t>Avenida de la Plata</w:t>
-      </w:r>
-      <w:r>
-        <w:rPr>
-          <w:rStyle w:val="apple-converted-space"/>
-          <w:rFonts w:ascii="Arial" w:hAnsi="Arial" w:cs="Arial"/>
-          <w:sz w:val="22"/>
-          <w:szCs w:val="22"/>
-        </w:rPr>
-        <w:t xml:space="preserve">, </w:t>
-      </w:r>
-      <w:r>
-        <w:rPr>
-          <w:rStyle w:val="apple-converted-space"/>
-          <w:rFonts w:ascii="Arial" w:hAnsi="Arial" w:cs="Arial"/>
-          <w:sz w:val="22"/>
-          <w:szCs w:val="22"/>
-        </w:rPr>
-        <w:t>número</w:t>
-      </w:r>
-      <w:r>
-        <w:rPr>
-          <w:rStyle w:val="apple-converted-space"/>
-          <w:rFonts w:ascii="Arial" w:hAnsi="Arial" w:cs="Arial"/>
-          <w:sz w:val="22"/>
-          <w:szCs w:val="22"/>
-        </w:rPr>
-        <w:t xml:space="preserve"> 102 A, Edificio E, Departamento 102</w:t>
-      </w:r>
-      <w:r>
-        <w:rPr>
-          <w:rStyle w:val="apple-converted-space"/>
-          <w:rFonts w:ascii="Arial" w:hAnsi="Arial" w:cs="Arial"/>
-          <w:sz w:val="22"/>
-          <w:szCs w:val="22"/>
-        </w:rPr>
-        <w:t xml:space="preserve">, </w:t>
-      </w:r>
-      <w:r>
-        <w:rPr>
-          <w:rStyle w:val="apple-converted-space"/>
-          <w:rFonts w:ascii="Arial" w:hAnsi="Arial" w:cs="Arial"/>
-          <w:sz w:val="22"/>
-          <w:szCs w:val="22"/>
-        </w:rPr>
-        <w:t>Residencial Platino</w:t>
-      </w:r>
-      <w:r>
-        <w:rPr>
-          <w:rStyle w:val="apple-converted-space"/>
-          <w:rFonts w:ascii="Arial" w:hAnsi="Arial" w:cs="Arial"/>
-          <w:sz w:val="22"/>
-          <w:szCs w:val="22"/>
-        </w:rPr>
-        <w:t xml:space="preserve">, </w:t>
-      </w:r>
-      <w:r>
-        <w:rPr>
-          <w:rStyle w:val="apple-converted-space"/>
-          <w:rFonts w:ascii="Arial" w:hAnsi="Arial" w:cs="Arial"/>
-          <w:sz w:val="22"/>
-          <w:szCs w:val="22"/>
-        </w:rPr>
-        <w:t xml:space="preserve">Código Postal </w:t>
-      </w:r>
-      <w:r>
-        <w:rPr>
-          <w:rStyle w:val="apple-converted-space"/>
-          <w:rFonts w:ascii="Arial" w:hAnsi="Arial" w:cs="Arial"/>
-          <w:sz w:val="22"/>
-          <w:szCs w:val="22"/>
-        </w:rPr>
-        <w:t>{{</w:t>
-      </w:r>
-      <w:proofErr w:type="spellStart"/>
-      <w:r>
-        <w:rPr>
-          <w:rStyle w:val="apple-converted-space"/>
-          <w:rFonts w:ascii="Arial" w:hAnsi="Arial" w:cs="Arial"/>
-          <w:sz w:val="22"/>
-          <w:szCs w:val="22"/>
-        </w:rPr>
-        <w:t>codigo.postal</w:t>
-      </w:r>
-      <w:r>
-        <w:rPr>
-          <w:rStyle w:val="apple-converted-space"/>
-          <w:rFonts w:ascii="Arial" w:hAnsi="Arial" w:cs="Arial"/>
-          <w:sz w:val="22"/>
-          <w:szCs w:val="22"/>
-        </w:rPr>
-        <w:t>_v</w:t>
-      </w:r>
-      <w:proofErr w:type="spellEnd"/>
-      <w:r>
-        <w:rPr>
-          <w:rStyle w:val="apple-converted-space"/>
-          <w:rFonts w:ascii="Arial" w:hAnsi="Arial" w:cs="Arial"/>
-          <w:sz w:val="22"/>
-          <w:szCs w:val="22"/>
-        </w:rPr>
-        <w:t>}}</w:t>
-      </w:r>
-      <w:r>
-        <w:rPr>
-          <w:rStyle w:val="apple-converted-space"/>
-          <w:rFonts w:ascii="Arial" w:hAnsi="Arial" w:cs="Arial"/>
-          <w:sz w:val="22"/>
-          <w:szCs w:val="22"/>
-        </w:rPr>
-        <w:t xml:space="preserve">, con fecha de nacimiento el día </w:t>
-      </w:r>
-      <w:r>
-        <w:rPr>
-          <w:rStyle w:val="apple-converted-space"/>
-          <w:rFonts w:ascii="Arial" w:hAnsi="Arial" w:cs="Arial"/>
-          <w:sz w:val="22"/>
-          <w:szCs w:val="22"/>
-        </w:rPr>
-        <w:t>{{</w:t>
-      </w:r>
-      <w:proofErr w:type="spellStart"/>
-      <w:r>
-        <w:rPr>
-          <w:rFonts w:ascii="Arial" w:hAnsi="Arial" w:cs="Arial"/>
-          <w:sz w:val="22"/>
-          <w:szCs w:val="22"/>
-        </w:rPr>
-        <w:t>fecha.nacimiento_v</w:t>
-      </w:r>
-      <w:proofErr w:type="spellEnd"/>
-      <w:r>
-        <w:rPr>
-          <w:rStyle w:val="apple-converted-space"/>
-          <w:rFonts w:ascii="Arial" w:hAnsi="Arial" w:cs="Arial"/>
-          <w:sz w:val="22"/>
-          <w:szCs w:val="22"/>
-        </w:rPr>
-        <w:t>}}</w:t>
-      </w:r>
-      <w:r>
-        <w:rPr>
-          <w:rStyle w:val="apple-converted-space"/>
-          <w:rFonts w:ascii="Arial" w:hAnsi="Arial" w:cs="Arial"/>
-          <w:sz w:val="22"/>
-          <w:szCs w:val="22"/>
-        </w:rPr>
-        <w:t xml:space="preserve"> (</w:t>
-      </w:r>
-      <w:r>
-        <w:rPr>
-          <w:rStyle w:val="apple-converted-space"/>
-          <w:rFonts w:ascii="Arial" w:hAnsi="Arial" w:cs="Arial"/>
-          <w:sz w:val="22"/>
-          <w:szCs w:val="22"/>
-        </w:rPr>
-        <w:t>{{</w:t>
-      </w:r>
-      <w:proofErr w:type="spellStart"/>
-      <w:r>
-        <w:rPr>
-          <w:rStyle w:val="apple-converted-space"/>
-          <w:rFonts w:ascii="Arial" w:hAnsi="Arial" w:cs="Arial"/>
-          <w:sz w:val="22"/>
-          <w:szCs w:val="22"/>
-        </w:rPr>
-        <w:t>ano.letra</w:t>
-      </w:r>
-      <w:proofErr w:type="spellEnd"/>
-      <w:r>
-        <w:rPr>
-          <w:rStyle w:val="apple-converted-space"/>
-          <w:rFonts w:ascii="Arial" w:hAnsi="Arial" w:cs="Arial"/>
-          <w:sz w:val="22"/>
-          <w:szCs w:val="22"/>
-        </w:rPr>
-        <w:t>}}</w:t>
-      </w:r>
-      <w:r>
-        <w:rPr>
-          <w:rStyle w:val="apple-converted-space"/>
-          <w:rFonts w:ascii="Arial" w:hAnsi="Arial" w:cs="Arial"/>
-          <w:sz w:val="22"/>
-          <w:szCs w:val="22"/>
-        </w:rPr>
-        <w:t xml:space="preserve">) de </w:t>
-      </w:r>
-      <w:r>
-        <w:rPr>
-          <w:rStyle w:val="apple-converted-space"/>
-          <w:rFonts w:ascii="Arial" w:hAnsi="Arial" w:cs="Arial"/>
-          <w:sz w:val="22"/>
-          <w:szCs w:val="22"/>
-        </w:rPr>
-        <w:t>{{</w:t>
-      </w:r>
-      <w:proofErr w:type="spellStart"/>
-      <w:r>
-        <w:rPr>
-          <w:rStyle w:val="apple-converted-space"/>
-          <w:rFonts w:ascii="Arial" w:hAnsi="Arial" w:cs="Arial"/>
-          <w:sz w:val="22"/>
-          <w:szCs w:val="22"/>
-        </w:rPr>
-        <w:t>edad.numero</w:t>
-      </w:r>
-      <w:proofErr w:type="spellEnd"/>
-      <w:r>
-        <w:rPr>
-          <w:rStyle w:val="apple-converted-space"/>
-          <w:rFonts w:ascii="Arial" w:hAnsi="Arial" w:cs="Arial"/>
-          <w:sz w:val="22"/>
-          <w:szCs w:val="22"/>
-        </w:rPr>
-        <w:t>}}</w:t>
-      </w:r>
-      <w:r>
-        <w:rPr>
-          <w:rStyle w:val="apple-converted-space"/>
-          <w:rFonts w:ascii="Arial" w:hAnsi="Arial" w:cs="Arial"/>
-          <w:sz w:val="22"/>
-          <w:szCs w:val="22"/>
-        </w:rPr>
-        <w:t xml:space="preserve"> </w:t>
-      </w:r>
-      <w:r>
-        <w:rPr>
-          <w:rStyle w:val="apple-converted-space"/>
-          <w:rFonts w:ascii="Arial" w:hAnsi="Arial" w:cs="Arial"/>
-          <w:sz w:val="22"/>
-          <w:szCs w:val="22"/>
-        </w:rPr>
-        <w:t>({{</w:t>
-      </w:r>
-      <w:proofErr w:type="spellStart"/>
-      <w:r>
-        <w:rPr>
-          <w:rStyle w:val="apple-converted-space"/>
-          <w:rFonts w:ascii="Arial" w:hAnsi="Arial" w:cs="Arial"/>
-          <w:sz w:val="22"/>
-          <w:szCs w:val="22"/>
-        </w:rPr>
-        <w:t>edad.letra</w:t>
-      </w:r>
-      <w:proofErr w:type="spellEnd"/>
-      <w:r>
-        <w:rPr>
-          <w:rStyle w:val="apple-converted-space"/>
-          <w:rFonts w:ascii="Arial" w:hAnsi="Arial" w:cs="Arial"/>
-          <w:sz w:val="22"/>
-          <w:szCs w:val="22"/>
-        </w:rPr>
-        <w:t xml:space="preserve">}}) </w:t>
-      </w:r>
-      <w:r>
-        <w:rPr>
-          <w:rStyle w:val="apple-converted-space"/>
-          <w:rFonts w:ascii="Arial" w:hAnsi="Arial" w:cs="Arial"/>
-          <w:sz w:val="22"/>
-          <w:szCs w:val="22"/>
-        </w:rPr>
-        <w:t xml:space="preserve">años de edad, </w:t>
-      </w:r>
-      <w:r>
-        <w:rPr>
-          <w:rStyle w:val="apple-converted-space"/>
-          <w:rFonts w:ascii="Arial" w:hAnsi="Arial" w:cs="Arial"/>
-          <w:sz w:val="22"/>
-          <w:szCs w:val="22"/>
-        </w:rPr>
-        <w:t>{{</w:t>
-      </w:r>
-      <w:proofErr w:type="spellStart"/>
-      <w:r>
-        <w:rPr>
-          <w:rStyle w:val="apple-converted-space"/>
-          <w:rFonts w:ascii="Arial" w:hAnsi="Arial" w:cs="Arial"/>
-          <w:sz w:val="22"/>
-          <w:szCs w:val="22"/>
-        </w:rPr>
-        <w:t>estado.civil</w:t>
-      </w:r>
-      <w:r>
-        <w:rPr>
-          <w:rStyle w:val="apple-converted-space"/>
-          <w:rFonts w:ascii="Arial" w:hAnsi="Arial" w:cs="Arial"/>
-          <w:sz w:val="22"/>
-          <w:szCs w:val="22"/>
-        </w:rPr>
-        <w:t>_v</w:t>
-      </w:r>
-      <w:proofErr w:type="spellEnd"/>
-      <w:r>
-        <w:rPr>
-          <w:rStyle w:val="apple-converted-space"/>
-          <w:rFonts w:ascii="Arial" w:hAnsi="Arial" w:cs="Arial"/>
-          <w:sz w:val="22"/>
-          <w:szCs w:val="22"/>
-        </w:rPr>
-        <w:t>}}</w:t>
-      </w:r>
-      <w:r>
-        <w:rPr>
-          <w:rStyle w:val="apple-converted-space"/>
-          <w:rFonts w:ascii="Arial" w:hAnsi="Arial" w:cs="Arial"/>
-          <w:sz w:val="22"/>
-          <w:szCs w:val="22"/>
-        </w:rPr>
-        <w:t xml:space="preserve">, de ocupación </w:t>
-      </w:r>
-      <w:r>
-        <w:rPr>
-          <w:rStyle w:val="apple-converted-space"/>
-          <w:rFonts w:ascii="Arial" w:hAnsi="Arial" w:cs="Arial"/>
-          <w:sz w:val="22"/>
-          <w:szCs w:val="22"/>
-        </w:rPr>
-        <w:t>{{</w:t>
-      </w:r>
-      <w:proofErr w:type="spellStart"/>
-      <w:r>
-        <w:rPr>
-          <w:rStyle w:val="apple-converted-space"/>
-          <w:rFonts w:ascii="Arial" w:hAnsi="Arial" w:cs="Arial"/>
-          <w:sz w:val="22"/>
-          <w:szCs w:val="22"/>
-        </w:rPr>
-        <w:t>ocupacion.vendedor</w:t>
-      </w:r>
-      <w:proofErr w:type="spellEnd"/>
-      <w:r>
-        <w:rPr>
-          <w:rStyle w:val="apple-converted-space"/>
-          <w:rFonts w:ascii="Arial" w:hAnsi="Arial" w:cs="Arial"/>
-          <w:sz w:val="22"/>
-          <w:szCs w:val="22"/>
-        </w:rPr>
-        <w:t>}}</w:t>
-      </w:r>
-      <w:r>
-        <w:rPr>
-          <w:rStyle w:val="apple-converted-space"/>
-          <w:rFonts w:ascii="Arial" w:hAnsi="Arial" w:cs="Arial"/>
-          <w:sz w:val="22"/>
-          <w:szCs w:val="22"/>
-        </w:rPr>
-        <w:t xml:space="preserve">, con Registro Federal de Contribuyentes número </w:t>
+        </w:rPr>
+        <w:t>"</w:t>
       </w:r>
       <w:r>
         <w:rPr>
@@ -6157,8 +6142,9 @@
           <w:sz w:val="22"/>
           <w:szCs w:val="22"/>
         </w:rPr>
-        <w:t>"</w:t>
-      </w:r>
+        <w:t>{{</w:t>
+      </w:r>
+      <w:proofErr w:type="spellStart"/>
       <w:r>
         <w:rPr>
           <w:rStyle w:val="apple-converted-space"/>
@@ -6168,8 +6154,9 @@
           <w:sz w:val="22"/>
           <w:szCs w:val="22"/>
         </w:rPr>
-        <w:t>CABM710308</w:t>
-      </w:r>
+        <w:t>vendedor.rfc</w:t>
+      </w:r>
+      <w:proofErr w:type="spellEnd"/>
       <w:r>
         <w:rPr>
           <w:rStyle w:val="apple-converted-space"/>
@@ -6179,16 +6166,7 @@
           <w:sz w:val="22"/>
           <w:szCs w:val="22"/>
         </w:rPr>
-        <w:t>",</w:t>
-      </w:r>
-      <w:r>
-        <w:rPr>
-          <w:rStyle w:val="apple-converted-space"/>
-          <w:rFonts w:ascii="Arial" w:hAnsi="Arial" w:cs="Arial"/>
-          <w:sz w:val="22"/>
-          <w:szCs w:val="22"/>
-        </w:rPr>
-        <w:t xml:space="preserve"> manifiesta no causar el pago del Impuesto Sobre la Renta, con Clave Única de Registro de Población número </w:t>
+        <w:t>}}</w:t>
       </w:r>
       <w:r>
         <w:rPr>
@@ -6199,7 +6177,16 @@
           <w:sz w:val="22"/>
           <w:szCs w:val="22"/>
         </w:rPr>
-        <w:t>"</w:t>
+        <w:t>",</w:t>
+      </w:r>
+      <w:r>
+        <w:rPr>
+          <w:rStyle w:val="apple-converted-space"/>
+          <w:rFonts w:ascii="Arial" w:hAnsi="Arial" w:cs="Arial"/>
+          <w:sz w:val="22"/>
+          <w:szCs w:val="22"/>
+        </w:rPr>
+        <w:t xml:space="preserve"> manifiesta no causar el pago del Impuesto Sobre la Renta, con Clave Única de Registro de Población número </w:t>
       </w:r>
       <w:r>
         <w:rPr>
@@ -6210,7 +6197,7 @@
           <w:sz w:val="22"/>
           <w:szCs w:val="22"/>
         </w:rPr>
-        <w:t>CABM710308HHGRRR05</w:t>
+        <w:t>"</w:t>
       </w:r>
       <w:r>
         <w:rPr>
@@ -6221,192 +6208,208 @@
           <w:sz w:val="22"/>
           <w:szCs w:val="22"/>
         </w:rPr>
-        <w:t>",</w:t>
-      </w:r>
+        <w:t>{{</w:t>
+      </w:r>
+      <w:proofErr w:type="spellStart"/>
       <w:r>
         <w:rPr>
           <w:rStyle w:val="apple-converted-space"/>
-          <w:rFonts w:ascii="Arial" w:hAnsi="Arial" w:cs="Arial"/>
-          <w:sz w:val="22"/>
-          <w:szCs w:val="22"/>
-        </w:rPr>
-        <w:t xml:space="preserve"> de nacionalidad mexicana, misma que conserva y declara saber firmar; quien se identifica con credencial para votar con fotografía con número de folio "</w:t>
-      </w:r>
-      <w:r>
-        <w:rPr>
-          <w:rStyle w:val="apple-converted-space"/>
-          <w:rFonts w:ascii="Arial" w:hAnsi="Arial" w:cs="Arial"/>
-          <w:sz w:val="22"/>
-          <w:szCs w:val="22"/>
-        </w:rPr>
-        <w:t>0940056358247</w:t>
-      </w:r>
-      <w:r>
-        <w:rPr>
-          <w:rStyle w:val="apple-converted-space"/>
-          <w:rFonts w:ascii="Arial" w:hAnsi="Arial" w:cs="Arial"/>
-          <w:sz w:val="22"/>
-          <w:szCs w:val="22"/>
-        </w:rPr>
-        <w:t>”, expedida por el Instituto Nacional Electoral, de paso por esta ciudad</w:t>
-      </w:r>
-      <w:r>
-        <w:rPr>
-          <w:rFonts w:ascii="Arial" w:hAnsi="Arial" w:cs="Arial"/>
-          <w:bCs/>
-          <w:sz w:val="22"/>
-          <w:szCs w:val="22"/>
-        </w:rPr>
-        <w:t>.</w:t>
-      </w:r>
-      <w:r>
-        <w:rPr>
-          <w:rFonts w:ascii="Arial" w:hAnsi="Arial" w:cs="Arial"/>
-          <w:bCs/>
-          <w:sz w:val="22"/>
-          <w:szCs w:val="22"/>
-        </w:rPr>
-        <w:t xml:space="preserve"> </w:t>
-      </w:r>
-      <w:r>
-        <w:rPr>
-          <w:rFonts w:ascii="Arial" w:hAnsi="Arial" w:cs="Arial"/>
-          <w:bCs/>
-          <w:sz w:val="22"/>
-          <w:szCs w:val="22"/>
-        </w:rPr>
-        <w:t xml:space="preserve">- - </w:t>
-      </w:r>
-      <w:r>
-        <w:rPr>
-          <w:rFonts w:ascii="Arial" w:hAnsi="Arial" w:cs="Arial"/>
-          <w:sz w:val="22"/>
-          <w:szCs w:val="22"/>
-        </w:rPr>
-        <w:t xml:space="preserve">- </w:t>
-      </w:r>
-      <w:r>
-        <w:rPr>
-          <w:rFonts w:ascii="Arial" w:hAnsi="Arial" w:cs="Arial"/>
-          <w:sz w:val="22"/>
-          <w:szCs w:val="22"/>
-        </w:rPr>
-        <w:t xml:space="preserve">- </w:t>
-      </w:r>
-      <w:r>
-        <w:rPr>
-          <w:rFonts w:ascii="Arial" w:hAnsi="Arial" w:cs="Arial"/>
-          <w:sz w:val="22"/>
-          <w:szCs w:val="22"/>
-        </w:rPr>
-        <w:t>- -</w:t>
-      </w:r>
-      <w:r>
-        <w:rPr>
-          <w:rFonts w:ascii="Arial" w:hAnsi="Arial" w:cs="Arial"/>
-          <w:sz w:val="22"/>
-          <w:szCs w:val="22"/>
-        </w:rPr>
-        <w:t xml:space="preserve"> - - - - - - - - - - - - - - - - - - - - - - - - -</w:t>
-      </w:r>
-      <w:r>
-        <w:rPr>
-          <w:rFonts w:ascii="Arial" w:hAnsi="Arial" w:cs="Arial"/>
-          <w:sz w:val="22"/>
-          <w:szCs w:val="22"/>
-        </w:rPr>
-        <w:t xml:space="preserve"> </w:t>
-      </w:r>
-      <w:r>
-        <w:rPr>
-          <w:rFonts w:ascii="Arial" w:hAnsi="Arial" w:cs="Arial"/>
-          <w:sz w:val="22"/>
-          <w:szCs w:val="22"/>
-        </w:rPr>
-        <w:t xml:space="preserve">- </w:t>
-      </w:r>
-      <w:r>
-        <w:rPr>
-          <w:rFonts w:ascii="Arial" w:hAnsi="Arial" w:cs="Arial"/>
-          <w:sz w:val="22"/>
-          <w:szCs w:val="22"/>
-        </w:rPr>
-        <w:t xml:space="preserve">- - - - </w:t>
-      </w:r>
-      <w:bookmarkEnd w:id="0"/>
-      <w:r>
-        <w:rPr>
-          <w:rFonts w:ascii="Arial" w:hAnsi="Arial" w:cs="Arial"/>
-          <w:sz w:val="22"/>
-          <w:szCs w:val="22"/>
-        </w:rPr>
-        <w:t>b</w:t>
-      </w:r>
-      <w:r>
-        <w:rPr>
-          <w:rFonts w:ascii="Arial" w:hAnsi="Arial" w:cs="Arial"/>
-          <w:color w:val="auto"/>
-          <w:sz w:val="22"/>
-          <w:szCs w:val="22"/>
-        </w:rPr>
-        <w:t xml:space="preserve">).- </w:t>
-      </w:r>
-      <w:r>
-        <w:rPr>
-          <w:rFonts w:ascii="Arial" w:hAnsi="Arial" w:cs="Arial"/>
-          <w:color w:val="auto"/>
-          <w:sz w:val="22"/>
-          <w:szCs w:val="22"/>
-        </w:rPr>
-        <w:t>El señor</w:t>
-      </w:r>
-      <w:r>
-        <w:rPr>
-          <w:rFonts w:ascii="Arial" w:hAnsi="Arial" w:cs="Arial"/>
-          <w:color w:val="auto"/>
-          <w:sz w:val="22"/>
-          <w:szCs w:val="22"/>
-        </w:rPr>
-        <w:t xml:space="preserve"> </w:t>
-      </w:r>
-      <w:r>
-        <w:rPr>
           <w:rFonts w:ascii="Arial" w:hAnsi="Arial" w:cs="Arial"/>
           <w:b/>
           <w:bCs/>
-          <w:color w:val="auto"/>
-          <w:sz w:val="22"/>
-          <w:szCs w:val="22"/>
-        </w:rPr>
-        <w:t>{{</w:t>
-      </w:r>
-      <w:proofErr w:type="spellStart"/>
-      <w:r>
-        <w:rPr>
-          <w:rStyle w:val="spellingerror"/>
+          <w:sz w:val="22"/>
+          <w:szCs w:val="22"/>
+        </w:rPr>
+        <w:t>vendedor.curp</w:t>
+      </w:r>
+      <w:proofErr w:type="spellEnd"/>
+      <w:r>
+        <w:rPr>
+          <w:rStyle w:val="apple-converted-space"/>
           <w:rFonts w:ascii="Arial" w:hAnsi="Arial" w:cs="Arial"/>
           <w:b/>
           <w:bCs/>
-          <w:color w:val="auto"/>
-          <w:sz w:val="22"/>
-          <w:szCs w:val="22"/>
-          <w:u w:val="single"/>
-        </w:rPr>
-        <w:t>comprador.nombre</w:t>
-      </w:r>
-      <w:proofErr w:type="spellEnd"/>
-      <w:r>
-        <w:rPr>
-          <w:rStyle w:val="spellingerror"/>
+          <w:sz w:val="22"/>
+          <w:szCs w:val="22"/>
+        </w:rPr>
+        <w:t>}}</w:t>
+      </w:r>
+      <w:r>
+        <w:rPr>
+          <w:rStyle w:val="apple-converted-space"/>
           <w:rFonts w:ascii="Arial" w:hAnsi="Arial" w:cs="Arial"/>
           <w:b/>
           <w:bCs/>
-          <w:color w:val="auto"/>
-          <w:sz w:val="22"/>
-          <w:szCs w:val="22"/>
-          <w:u w:val="single"/>
+          <w:sz w:val="22"/>
+          <w:szCs w:val="22"/>
+        </w:rPr>
+        <w:t>",</w:t>
+      </w:r>
+      <w:r>
+        <w:rPr>
+          <w:rStyle w:val="apple-converted-space"/>
+          <w:rFonts w:ascii="Arial" w:hAnsi="Arial" w:cs="Arial"/>
+          <w:sz w:val="22"/>
+          <w:szCs w:val="22"/>
+        </w:rPr>
+        <w:t xml:space="preserve"> de nacionalidad mexicana, misma que conserva y declara saber firmar; quien se identifica con credencial para votar con fotografía con número de folio "</w:t>
+      </w:r>
+      <w:r>
+        <w:rPr>
+          <w:rStyle w:val="apple-converted-space"/>
+          <w:rFonts w:ascii="Arial" w:hAnsi="Arial" w:cs="Arial"/>
+          <w:sz w:val="22"/>
+          <w:szCs w:val="22"/>
+        </w:rPr>
+        <w:t>{{</w:t>
+      </w:r>
+      <w:proofErr w:type="spellStart"/>
+      <w:r>
+        <w:rPr>
+          <w:rStyle w:val="apple-converted-space"/>
+          <w:rFonts w:ascii="Arial" w:hAnsi="Arial" w:cs="Arial"/>
+          <w:sz w:val="22"/>
+          <w:szCs w:val="22"/>
+        </w:rPr>
+        <w:t>vendedor.numero_ine</w:t>
+      </w:r>
+      <w:proofErr w:type="spellEnd"/>
+      <w:r>
+        <w:rPr>
+          <w:rStyle w:val="apple-converted-space"/>
+          <w:rFonts w:ascii="Arial" w:hAnsi="Arial" w:cs="Arial"/>
+          <w:sz w:val="22"/>
+          <w:szCs w:val="22"/>
         </w:rPr>
         <w:t>}}</w:t>
+      </w:r>
+      <w:r>
+        <w:rPr>
+          <w:rStyle w:val="apple-converted-space"/>
+          <w:rFonts w:ascii="Arial" w:hAnsi="Arial" w:cs="Arial"/>
+          <w:sz w:val="22"/>
+          <w:szCs w:val="22"/>
+        </w:rPr>
+        <w:t>”, expedida por el Instituto Nacional Electoral, de paso por esta ciudad</w:t>
+      </w:r>
+      <w:r>
+        <w:rPr>
+          <w:rFonts w:ascii="Arial" w:hAnsi="Arial" w:cs="Arial"/>
+          <w:bCs/>
+          <w:sz w:val="22"/>
+          <w:szCs w:val="22"/>
+        </w:rPr>
+        <w:t>.</w:t>
+      </w:r>
+      <w:r>
+        <w:rPr>
+          <w:rFonts w:ascii="Arial" w:hAnsi="Arial" w:cs="Arial"/>
+          <w:bCs/>
+          <w:sz w:val="22"/>
+          <w:szCs w:val="22"/>
+        </w:rPr>
+        <w:t xml:space="preserve"> </w:t>
+      </w:r>
+      <w:r>
+        <w:rPr>
+          <w:rFonts w:ascii="Arial" w:hAnsi="Arial" w:cs="Arial"/>
+          <w:bCs/>
+          <w:sz w:val="22"/>
+          <w:szCs w:val="22"/>
+        </w:rPr>
+        <w:t xml:space="preserve">- - </w:t>
+      </w:r>
+      <w:r>
+        <w:rPr>
+          <w:rFonts w:ascii="Arial" w:hAnsi="Arial" w:cs="Arial"/>
+          <w:sz w:val="22"/>
+          <w:szCs w:val="22"/>
+        </w:rPr>
+        <w:t xml:space="preserve">- </w:t>
+      </w:r>
+      <w:r>
+        <w:rPr>
+          <w:rFonts w:ascii="Arial" w:hAnsi="Arial" w:cs="Arial"/>
+          <w:sz w:val="22"/>
+          <w:szCs w:val="22"/>
+        </w:rPr>
+        <w:t xml:space="preserve">- </w:t>
+      </w:r>
+      <w:r>
+        <w:rPr>
+          <w:rFonts w:ascii="Arial" w:hAnsi="Arial" w:cs="Arial"/>
+          <w:sz w:val="22"/>
+          <w:szCs w:val="22"/>
+        </w:rPr>
+        <w:t>- -</w:t>
+      </w:r>
+      <w:r>
+        <w:rPr>
+          <w:rFonts w:ascii="Arial" w:hAnsi="Arial" w:cs="Arial"/>
+          <w:sz w:val="22"/>
+          <w:szCs w:val="22"/>
+        </w:rPr>
+        <w:t xml:space="preserve"> - - - - - - - - - - - - - - - - - - - - - - - - -</w:t>
+      </w:r>
+      <w:r>
+        <w:rPr>
+          <w:rFonts w:ascii="Arial" w:hAnsi="Arial" w:cs="Arial"/>
+          <w:sz w:val="22"/>
+          <w:szCs w:val="22"/>
+        </w:rPr>
+        <w:t xml:space="preserve"> </w:t>
+      </w:r>
+      <w:r>
+        <w:rPr>
+          <w:rFonts w:ascii="Arial" w:hAnsi="Arial" w:cs="Arial"/>
+          <w:sz w:val="22"/>
+          <w:szCs w:val="22"/>
+        </w:rPr>
+        <w:t xml:space="preserve">- </w:t>
+      </w:r>
+      <w:r>
+        <w:rPr>
+          <w:rFonts w:ascii="Arial" w:hAnsi="Arial" w:cs="Arial"/>
+          <w:sz w:val="22"/>
+          <w:szCs w:val="22"/>
+        </w:rPr>
+        <w:t xml:space="preserve">- - - - </w:t>
+      </w:r>
+      <w:bookmarkEnd w:id="0"/>
+      <w:r>
+        <w:rPr>
+          <w:rFonts w:ascii="Arial" w:hAnsi="Arial" w:cs="Arial"/>
+          <w:sz w:val="22"/>
+          <w:szCs w:val="22"/>
+        </w:rPr>
+        <w:t>b</w:t>
+      </w:r>
+      <w:r>
+        <w:rPr>
+          <w:rFonts w:ascii="Arial" w:hAnsi="Arial" w:cs="Arial"/>
+          <w:color w:val="auto"/>
+          <w:sz w:val="22"/>
+          <w:szCs w:val="22"/>
+        </w:rPr>
+        <w:t xml:space="preserve">).- </w:t>
+      </w:r>
+      <w:r>
+        <w:rPr>
+          <w:rFonts w:ascii="Arial" w:hAnsi="Arial" w:cs="Arial"/>
+          <w:color w:val="auto"/>
+          <w:sz w:val="22"/>
+          <w:szCs w:val="22"/>
+        </w:rPr>
+        <w:t>El señor</w:t>
+      </w:r>
+      <w:r>
+        <w:rPr>
+          <w:rFonts w:ascii="Arial" w:hAnsi="Arial" w:cs="Arial"/>
+          <w:color w:val="auto"/>
+          <w:sz w:val="22"/>
+          <w:szCs w:val="22"/>
+        </w:rPr>
+        <w:t xml:space="preserve"> </w:t>
       </w:r>
       <w:r>
         <w:rPr>
@@ -6416,8 +6419,47 @@
           <w:color w:val="auto"/>
           <w:sz w:val="22"/>
           <w:szCs w:val="22"/>
+        </w:rPr>
+        <w:t>{{</w:t>
+      </w:r>
+      <w:proofErr w:type="spellStart"/>
+      <w:r>
+        <w:rPr>
+          <w:rStyle w:val="spellingerror"/>
+          <w:rFonts w:ascii="Arial" w:hAnsi="Arial" w:cs="Arial"/>
+          <w:b/>
+          <w:bCs/>
+          <w:color w:val="auto"/>
+          <w:sz w:val="22"/>
+          <w:szCs w:val="22"/>
           <w:u w:val="single"/>
         </w:rPr>
+        <w:t>comprador.nombre</w:t>
+      </w:r>
+      <w:proofErr w:type="spellEnd"/>
+      <w:r>
+        <w:rPr>
+          <w:rStyle w:val="spellingerror"/>
+          <w:rFonts w:ascii="Arial" w:hAnsi="Arial" w:cs="Arial"/>
+          <w:b/>
+          <w:bCs/>
+          <w:color w:val="auto"/>
+          <w:sz w:val="22"/>
+          <w:szCs w:val="22"/>
+          <w:u w:val="single"/>
+        </w:rPr>
+        <w:t>}}</w:t>
+      </w:r>
+      <w:r>
+        <w:rPr>
+          <w:rFonts w:ascii="Arial" w:hAnsi="Arial" w:cs="Arial"/>
+          <w:b/>
+          <w:bCs/>
+          <w:color w:val="auto"/>
+          <w:sz w:val="22"/>
+          <w:szCs w:val="22"/>
+          <w:u w:val="single"/>
+        </w:rPr>
         <w:t>,</w:t>
       </w:r>
       <w:r>
@@ -6501,7 +6543,7 @@
           <w:sz w:val="22"/>
           <w:szCs w:val="22"/>
         </w:rPr>
-        <w:t>codigo.postal_c</w:t>
+        <w:t>comprador.codigo_postal</w:t>
       </w:r>
       <w:proofErr w:type="spellEnd"/>
       <w:r>
@@ -6858,22 +6900,15 @@
           <w:sz w:val="22"/>
           <w:szCs w:val="22"/>
         </w:rPr>
-        <w:t xml:space="preserve"> -</w:t>
-      </w:r>
-      <w:r>
-        <w:rPr>
-          <w:rFonts w:ascii="Arial" w:hAnsi="Arial" w:cs="Arial"/>
-          <w:sz w:val="22"/>
-          <w:szCs w:val="22"/>
-        </w:rPr>
-        <w:t xml:space="preserve"> </w:t>
-      </w:r>
-      <w:r>
-        <w:rPr>
-          <w:rFonts w:ascii="Arial" w:hAnsi="Arial" w:cs="Arial"/>
-          <w:sz w:val="22"/>
-          <w:szCs w:val="22"/>
-        </w:rPr>
+        <w:t xml:space="preserve"> </w:t>
+      </w:r>
+      <w:r>
+        <w:rPr>
+          <w:rFonts w:ascii="Arial" w:hAnsi="Arial" w:cs="Arial"/>
+          <w:sz w:val="22"/>
+          <w:szCs w:val="22"/>
+        </w:rPr>
+        <w:lastRenderedPageBreak/>
         <w:t>-</w:t>
       </w:r>
       <w:r>
@@ -6906,16 +6941,23 @@
           <w:sz w:val="22"/>
           <w:szCs w:val="22"/>
         </w:rPr>
-        <w:t xml:space="preserve">I.- La verdad de este acto jurídico. - - - - - - - - - - - - - - - - - - - - - - - - - - - - - - </w:t>
-      </w:r>
-      <w:r>
-        <w:rPr>
-          <w:rFonts w:ascii="Arial" w:hAnsi="Arial" w:cs="Arial"/>
-          <w:sz w:val="22"/>
-          <w:szCs w:val="22"/>
-        </w:rPr>
-        <w:lastRenderedPageBreak/>
-        <w:t xml:space="preserve">- </w:t>
+        <w:t>-</w:t>
+      </w:r>
+      <w:r>
+        <w:rPr>
+          <w:rFonts w:ascii="Arial" w:hAnsi="Arial" w:cs="Arial"/>
+          <w:sz w:val="22"/>
+          <w:szCs w:val="22"/>
+        </w:rPr>
+        <w:t xml:space="preserve"> </w:t>
+      </w:r>
+      <w:r>
+        <w:rPr>
+          <w:rFonts w:ascii="Arial" w:hAnsi="Arial" w:cs="Arial"/>
+          <w:sz w:val="22"/>
+          <w:szCs w:val="22"/>
+        </w:rPr>
+        <w:t xml:space="preserve">I.- La verdad de este acto jurídico. - - - - - - - - - - - - - - - - - - - - - - - - - - - - - - - </w:t>
       </w:r>
       <w:r>
         <w:rPr>
@@ -7330,7 +7372,6 @@
         <w:t>{{</w:t>
       </w:r>
       <w:proofErr w:type="spellStart"/>
-      <w:proofErr w:type="gramStart"/>
       <w:r>
         <w:rPr>
           <w:rStyle w:val="spellingerror"/>
@@ -7363,9 +7404,8 @@
           <w:sz w:val="22"/>
           <w:szCs w:val="22"/>
         </w:rPr>
-        <w:t xml:space="preserve">   </w:t>
-      </w:r>
-      <w:proofErr w:type="gramEnd"/>
+        <w:t xml:space="preserve">                                </w:t>
+      </w:r>
       <w:r>
         <w:rPr>
           <w:rStyle w:val="spellingerror"/>
@@ -7375,9 +7415,9 @@
           <w:sz w:val="22"/>
           <w:szCs w:val="22"/>
         </w:rPr>
-        <w:t xml:space="preserve">                          </w:t>
-      </w:r>
-      <w:proofErr w:type="gramStart"/>
+        <w:t>{{</w:t>
+      </w:r>
+      <w:proofErr w:type="spellStart"/>
       <w:r>
         <w:rPr>
           <w:rStyle w:val="spellingerror"/>
@@ -7387,46 +7427,9 @@
           <w:sz w:val="22"/>
           <w:szCs w:val="22"/>
         </w:rPr>
-        <w:t xml:space="preserve">   </w:t>
-      </w:r>
-      <w:r>
-        <w:rPr>
-          <w:rStyle w:val="spellingerror"/>
-          <w:rFonts w:ascii="Arial" w:eastAsia="Arial" w:hAnsi="Arial" w:cs="Arial"/>
-          <w:bCs/>
-          <w:color w:val="00B0F0"/>
-          <w:sz w:val="22"/>
-          <w:szCs w:val="22"/>
-        </w:rPr>
-        <w:t>{</w:t>
-      </w:r>
-      <w:proofErr w:type="gramEnd"/>
-      <w:r>
-        <w:rPr>
-          <w:rStyle w:val="spellingerror"/>
-          <w:rFonts w:ascii="Arial" w:eastAsia="Arial" w:hAnsi="Arial" w:cs="Arial"/>
-          <w:bCs/>
-          <w:color w:val="00B0F0"/>
-          <w:sz w:val="22"/>
-          <w:szCs w:val="22"/>
-        </w:rPr>
-        <w:t>{</w:t>
-      </w:r>
-      <w:proofErr w:type="spellStart"/>
-      <w:proofErr w:type="gramStart"/>
-      <w:r>
-        <w:rPr>
-          <w:rStyle w:val="spellingerror"/>
-          <w:rFonts w:ascii="Arial" w:eastAsia="Arial" w:hAnsi="Arial" w:cs="Arial"/>
-          <w:bCs/>
-          <w:color w:val="00B0F0"/>
-          <w:sz w:val="22"/>
-          <w:szCs w:val="22"/>
-        </w:rPr>
         <w:t>comprador.nombre</w:t>
       </w:r>
       <w:proofErr w:type="spellEnd"/>
-      <w:proofErr w:type="gramEnd"/>
       <w:r>
         <w:rPr>
           <w:rStyle w:val="spellingerror"/>
@@ -7780,62 +7783,28 @@
           <w:szCs w:val="22"/>
           <w:lang w:val="es-ES_tradnl" w:bidi="ar-SA"/>
         </w:rPr>
-        <w:t xml:space="preserve">- - -Ante </w:t>
-      </w:r>
-      <w:proofErr w:type="gramStart"/>
+        <w:t xml:space="preserve">- - -Ante mi.- </w:t>
+      </w:r>
       <w:r>
         <w:rPr>
           <w:rFonts w:ascii="Arial" w:eastAsia="Times New Roman" w:hAnsi="Arial" w:cs="Arial"/>
           <w:color w:val="auto"/>
           <w:sz w:val="22"/>
           <w:szCs w:val="22"/>
+          <w:lang w:bidi="ar-SA"/>
+        </w:rPr>
+        <w:t>Rubrica. - Señora</w:t>
+      </w:r>
+      <w:r>
+        <w:rPr>
+          <w:rFonts w:ascii="Arial" w:eastAsia="Times New Roman" w:hAnsi="Arial" w:cs="Arial"/>
+          <w:color w:val="auto"/>
+          <w:sz w:val="22"/>
+          <w:szCs w:val="22"/>
           <w:lang w:val="es-ES_tradnl" w:bidi="ar-SA"/>
         </w:rPr>
-        <w:t>mi.-</w:t>
-      </w:r>
-      <w:proofErr w:type="gramEnd"/>
-      <w:r>
-        <w:rPr>
-          <w:rFonts w:ascii="Arial" w:eastAsia="Times New Roman" w:hAnsi="Arial" w:cs="Arial"/>
-          <w:color w:val="auto"/>
-          <w:sz w:val="22"/>
-          <w:szCs w:val="22"/>
-          <w:lang w:val="es-ES_tradnl" w:bidi="ar-SA"/>
-        </w:rPr>
-        <w:t xml:space="preserve"> </w:t>
-      </w:r>
-      <w:r>
-        <w:rPr>
-          <w:rFonts w:ascii="Arial" w:eastAsia="Times New Roman" w:hAnsi="Arial" w:cs="Arial"/>
-          <w:color w:val="auto"/>
-          <w:sz w:val="22"/>
-          <w:szCs w:val="22"/>
-          <w:lang w:bidi="ar-SA"/>
-        </w:rPr>
-        <w:t xml:space="preserve">Rubrica. - </w:t>
-      </w:r>
-      <w:proofErr w:type="gramStart"/>
-      <w:r>
-        <w:rPr>
-          <w:rFonts w:ascii="Arial" w:eastAsia="Times New Roman" w:hAnsi="Arial" w:cs="Arial"/>
-          <w:color w:val="auto"/>
-          <w:sz w:val="22"/>
-          <w:szCs w:val="22"/>
-          <w:lang w:bidi="ar-SA"/>
-        </w:rPr>
-        <w:t>Señora</w:t>
-      </w:r>
-      <w:r>
-        <w:rPr>
-          <w:rFonts w:ascii="Arial" w:eastAsia="Times New Roman" w:hAnsi="Arial" w:cs="Arial"/>
-          <w:color w:val="auto"/>
-          <w:sz w:val="22"/>
-          <w:szCs w:val="22"/>
-          <w:lang w:val="es-ES_tradnl" w:bidi="ar-SA"/>
-        </w:rPr>
         <w:t>.-</w:t>
       </w:r>
-      <w:proofErr w:type="gramEnd"/>
       <w:r>
         <w:rPr>
           <w:rFonts w:ascii="Arial" w:eastAsia="Times New Roman" w:hAnsi="Arial" w:cs="Arial"/>
@@ -7910,9 +7879,116 @@
           <w:szCs w:val="22"/>
           <w:lang w:val="es-ES_tradnl" w:bidi="ar-SA"/>
         </w:rPr>
-        <w:t xml:space="preserve"> </w:t>
-      </w:r>
-      <w:proofErr w:type="gramStart"/>
+        <w:t xml:space="preserve"> Tejeda</w:t>
+      </w:r>
+      <w:r>
+        <w:rPr>
+          <w:rFonts w:ascii="Arial" w:eastAsia="Times New Roman" w:hAnsi="Arial" w:cs="Arial"/>
+          <w:color w:val="auto"/>
+          <w:sz w:val="22"/>
+          <w:szCs w:val="22"/>
+          <w:lang w:bidi="ar-SA"/>
+        </w:rPr>
+        <w:t>.-</w:t>
+      </w:r>
+      <w:r>
+        <w:rPr>
+          <w:rFonts w:ascii="Arial" w:eastAsia="Times New Roman" w:hAnsi="Arial" w:cs="Arial"/>
+          <w:color w:val="auto"/>
+          <w:sz w:val="22"/>
+          <w:szCs w:val="22"/>
+          <w:lang w:val="es-ES_tradnl" w:bidi="ar-SA"/>
+        </w:rPr>
+        <w:t xml:space="preserve"> Rubrica.- Señor. -</w:t>
+      </w:r>
+      <w:r>
+        <w:rPr>
+          <w:rFonts w:ascii="Arial" w:hAnsi="Arial" w:cs="Arial"/>
+          <w:sz w:val="22"/>
+          <w:szCs w:val="22"/>
+        </w:rPr>
+        <w:t xml:space="preserve"> </w:t>
+      </w:r>
+      <w:r>
+        <w:rPr>
+          <w:rFonts w:ascii="Arial" w:hAnsi="Arial" w:cs="Arial"/>
+          <w:color w:val="4472C4" w:themeColor="accent5"/>
+        </w:rPr>
+        <w:t>Luis Copca Clemente</w:t>
+      </w:r>
+      <w:r>
+        <w:rPr>
+          <w:rFonts w:ascii="Arial" w:hAnsi="Arial" w:cs="Arial"/>
+        </w:rPr>
+        <w:t xml:space="preserve">.- Rubrica. Señor.- </w:t>
+      </w:r>
+      <w:r>
+        <w:rPr>
+          <w:rFonts w:ascii="Arial" w:hAnsi="Arial" w:cs="Arial"/>
+          <w:color w:val="4472C4" w:themeColor="accent5"/>
+          <w:sz w:val="22"/>
+          <w:szCs w:val="22"/>
+        </w:rPr>
+        <w:t>Hipólito Alejandro Espitia Monroy</w:t>
+      </w:r>
+      <w:r>
+        <w:rPr>
+          <w:rFonts w:ascii="Arial" w:hAnsi="Arial" w:cs="Arial"/>
+          <w:sz w:val="22"/>
+          <w:szCs w:val="22"/>
+        </w:rPr>
+        <w:t>.-</w:t>
+      </w:r>
+      <w:r>
+        <w:rPr>
+          <w:rFonts w:ascii="Arial" w:eastAsia="Times New Roman" w:hAnsi="Arial" w:cs="Arial"/>
+          <w:color w:val="auto"/>
+          <w:sz w:val="22"/>
+          <w:szCs w:val="22"/>
+          <w:lang w:val="es-ES_tradnl" w:bidi="ar-SA"/>
+        </w:rPr>
+        <w:t xml:space="preserve"> Rubrica.- Una firma ilegible del Ciudadano Licenciado Edén Khadaffy Cornejo </w:t>
+      </w:r>
+      <w:r>
+        <w:rPr>
+          <w:rFonts w:ascii="Arial" w:eastAsia="Times New Roman" w:hAnsi="Arial" w:cs="Arial"/>
+          <w:color w:val="auto"/>
+          <w:sz w:val="22"/>
+          <w:szCs w:val="22"/>
+          <w:lang w:val="es-ES_tradnl" w:bidi="ar-SA"/>
+        </w:rPr>
+        <w:t>Gómez. -</w:t>
+      </w:r>
+      <w:r>
+        <w:rPr>
+          <w:rFonts w:ascii="Arial" w:eastAsia="Times New Roman" w:hAnsi="Arial" w:cs="Arial"/>
+          <w:color w:val="auto"/>
+          <w:sz w:val="22"/>
+          <w:szCs w:val="22"/>
+          <w:lang w:val="es-ES_tradnl" w:bidi="ar-SA"/>
+        </w:rPr>
+        <w:t xml:space="preserve"> El sello de la </w:t>
+      </w:r>
+      <w:r>
+        <w:rPr>
+          <w:rFonts w:ascii="Arial" w:eastAsia="Times New Roman" w:hAnsi="Arial" w:cs="Arial"/>
+          <w:color w:val="auto"/>
+          <w:sz w:val="22"/>
+          <w:szCs w:val="22"/>
+          <w:lang w:val="es-ES_tradnl" w:bidi="ar-SA"/>
+        </w:rPr>
+        <w:t>notaría</w:t>
+      </w:r>
+      <w:r>
+        <w:rPr>
+          <w:rFonts w:ascii="Arial" w:eastAsia="Times New Roman" w:hAnsi="Arial" w:cs="Arial"/>
+          <w:color w:val="auto"/>
+          <w:sz w:val="22"/>
+          <w:szCs w:val="22"/>
+          <w:lang w:val="es-ES_tradnl" w:bidi="ar-SA"/>
+        </w:rPr>
+        <w:t xml:space="preserve">. - - - - - - - - - - - - - - - - - - - - - - - - - - - - - - - - - A u t o r i z o.- La escritura que antecede en la Ciudad de Tezontepec de Aldama, Estado de Hidalgo, a los </w:t>
+      </w:r>
       <w:r>
         <w:rPr>
           <w:rFonts w:ascii="Arial" w:eastAsia="Times New Roman" w:hAnsi="Arial" w:cs="Arial"/>
@@ -7921,200 +7997,7 @@
           <w:szCs w:val="22"/>
           <w:lang w:val="es-ES_tradnl" w:bidi="ar-SA"/>
         </w:rPr>
-        <w:t>Tejeda</w:t>
-      </w:r>
-      <w:r>
-        <w:rPr>
-          <w:rFonts w:ascii="Arial" w:eastAsia="Times New Roman" w:hAnsi="Arial" w:cs="Arial"/>
-          <w:color w:val="auto"/>
-          <w:sz w:val="22"/>
-          <w:szCs w:val="22"/>
-          <w:lang w:bidi="ar-SA"/>
-        </w:rPr>
-        <w:t>.-</w:t>
-      </w:r>
-      <w:proofErr w:type="gramEnd"/>
-      <w:r>
-        <w:rPr>
-          <w:rFonts w:ascii="Arial" w:eastAsia="Times New Roman" w:hAnsi="Arial" w:cs="Arial"/>
-          <w:color w:val="auto"/>
-          <w:sz w:val="22"/>
-          <w:szCs w:val="22"/>
-          <w:lang w:val="es-ES_tradnl" w:bidi="ar-SA"/>
-        </w:rPr>
-        <w:t xml:space="preserve"> </w:t>
-      </w:r>
-      <w:proofErr w:type="gramStart"/>
-      <w:r>
-        <w:rPr>
-          <w:rFonts w:ascii="Arial" w:eastAsia="Times New Roman" w:hAnsi="Arial" w:cs="Arial"/>
-          <w:color w:val="auto"/>
-          <w:sz w:val="22"/>
-          <w:szCs w:val="22"/>
-          <w:lang w:val="es-ES_tradnl" w:bidi="ar-SA"/>
-        </w:rPr>
-        <w:t>Rubrica.-</w:t>
-      </w:r>
-      <w:proofErr w:type="gramEnd"/>
-      <w:r>
-        <w:rPr>
-          <w:rFonts w:ascii="Arial" w:eastAsia="Times New Roman" w:hAnsi="Arial" w:cs="Arial"/>
-          <w:color w:val="auto"/>
-          <w:sz w:val="22"/>
-          <w:szCs w:val="22"/>
-          <w:lang w:val="es-ES_tradnl" w:bidi="ar-SA"/>
-        </w:rPr>
-        <w:t xml:space="preserve"> Señor. -</w:t>
-      </w:r>
-      <w:r>
-        <w:rPr>
-          <w:rFonts w:ascii="Arial" w:hAnsi="Arial" w:cs="Arial"/>
-          <w:sz w:val="22"/>
-          <w:szCs w:val="22"/>
-        </w:rPr>
-        <w:t xml:space="preserve"> </w:t>
-      </w:r>
-      <w:r>
-        <w:rPr>
-          <w:rFonts w:ascii="Arial" w:hAnsi="Arial" w:cs="Arial"/>
-          <w:color w:val="4472C4" w:themeColor="accent5"/>
-        </w:rPr>
-        <w:t xml:space="preserve">Luis Copca </w:t>
-      </w:r>
-      <w:proofErr w:type="gramStart"/>
-      <w:r>
-        <w:rPr>
-          <w:rFonts w:ascii="Arial" w:hAnsi="Arial" w:cs="Arial"/>
-          <w:color w:val="4472C4" w:themeColor="accent5"/>
-        </w:rPr>
-        <w:t>Clemente</w:t>
-      </w:r>
-      <w:r>
-        <w:rPr>
-          <w:rFonts w:ascii="Arial" w:hAnsi="Arial" w:cs="Arial"/>
-        </w:rPr>
-        <w:t>.-</w:t>
-      </w:r>
-      <w:proofErr w:type="gramEnd"/>
-      <w:r>
-        <w:rPr>
-          <w:rFonts w:ascii="Arial" w:hAnsi="Arial" w:cs="Arial"/>
-        </w:rPr>
-        <w:t xml:space="preserve"> Rubrica. </w:t>
-      </w:r>
-      <w:proofErr w:type="gramStart"/>
-      <w:r>
-        <w:rPr>
-          <w:rFonts w:ascii="Arial" w:hAnsi="Arial" w:cs="Arial"/>
-        </w:rPr>
-        <w:t>Señor.-</w:t>
-      </w:r>
-      <w:proofErr w:type="gramEnd"/>
-      <w:r>
-        <w:rPr>
-          <w:rFonts w:ascii="Arial" w:hAnsi="Arial" w:cs="Arial"/>
-        </w:rPr>
-        <w:t xml:space="preserve"> </w:t>
-      </w:r>
-      <w:r>
-        <w:rPr>
-          <w:rFonts w:ascii="Arial" w:hAnsi="Arial" w:cs="Arial"/>
-          <w:color w:val="4472C4" w:themeColor="accent5"/>
-          <w:sz w:val="22"/>
-          <w:szCs w:val="22"/>
-        </w:rPr>
-        <w:t xml:space="preserve">Hipólito Alejandro Espitia </w:t>
-      </w:r>
-      <w:proofErr w:type="gramStart"/>
-      <w:r>
-        <w:rPr>
-          <w:rFonts w:ascii="Arial" w:hAnsi="Arial" w:cs="Arial"/>
-          <w:color w:val="4472C4" w:themeColor="accent5"/>
-          <w:sz w:val="22"/>
-          <w:szCs w:val="22"/>
-        </w:rPr>
-        <w:t>Monroy</w:t>
-      </w:r>
-      <w:r>
-        <w:rPr>
-          <w:rFonts w:ascii="Arial" w:hAnsi="Arial" w:cs="Arial"/>
-          <w:sz w:val="22"/>
-          <w:szCs w:val="22"/>
-        </w:rPr>
-        <w:t>.-</w:t>
-      </w:r>
-      <w:proofErr w:type="gramEnd"/>
-      <w:r>
-        <w:rPr>
-          <w:rFonts w:ascii="Arial" w:eastAsia="Times New Roman" w:hAnsi="Arial" w:cs="Arial"/>
-          <w:color w:val="auto"/>
-          <w:sz w:val="22"/>
-          <w:szCs w:val="22"/>
-          <w:lang w:val="es-ES_tradnl" w:bidi="ar-SA"/>
-        </w:rPr>
-        <w:t xml:space="preserve"> </w:t>
-      </w:r>
-      <w:proofErr w:type="gramStart"/>
-      <w:r>
-        <w:rPr>
-          <w:rFonts w:ascii="Arial" w:eastAsia="Times New Roman" w:hAnsi="Arial" w:cs="Arial"/>
-          <w:color w:val="auto"/>
-          <w:sz w:val="22"/>
-          <w:szCs w:val="22"/>
-          <w:lang w:val="es-ES_tradnl" w:bidi="ar-SA"/>
-        </w:rPr>
-        <w:t>Rubrica.-</w:t>
-      </w:r>
-      <w:proofErr w:type="gramEnd"/>
-      <w:r>
-        <w:rPr>
-          <w:rFonts w:ascii="Arial" w:eastAsia="Times New Roman" w:hAnsi="Arial" w:cs="Arial"/>
-          <w:color w:val="auto"/>
-          <w:sz w:val="22"/>
-          <w:szCs w:val="22"/>
-          <w:lang w:val="es-ES_tradnl" w:bidi="ar-SA"/>
-        </w:rPr>
-        <w:t xml:space="preserve"> Una firma ilegible del Ciudadano Licenciado Edén Khadaffy Cornejo </w:t>
-      </w:r>
-      <w:r>
-        <w:rPr>
-          <w:rFonts w:ascii="Arial" w:eastAsia="Times New Roman" w:hAnsi="Arial" w:cs="Arial"/>
-          <w:color w:val="auto"/>
-          <w:sz w:val="22"/>
-          <w:szCs w:val="22"/>
-          <w:lang w:val="es-ES_tradnl" w:bidi="ar-SA"/>
-        </w:rPr>
-        <w:t>Gómez. -</w:t>
-      </w:r>
-      <w:r>
-        <w:rPr>
-          <w:rFonts w:ascii="Arial" w:eastAsia="Times New Roman" w:hAnsi="Arial" w:cs="Arial"/>
-          <w:color w:val="auto"/>
-          <w:sz w:val="22"/>
-          <w:szCs w:val="22"/>
-          <w:lang w:val="es-ES_tradnl" w:bidi="ar-SA"/>
-        </w:rPr>
-        <w:t xml:space="preserve"> El sello de la </w:t>
-      </w:r>
-      <w:r>
-        <w:rPr>
-          <w:rFonts w:ascii="Arial" w:eastAsia="Times New Roman" w:hAnsi="Arial" w:cs="Arial"/>
-          <w:color w:val="auto"/>
-          <w:sz w:val="22"/>
-          <w:szCs w:val="22"/>
-          <w:lang w:val="es-ES_tradnl" w:bidi="ar-SA"/>
-        </w:rPr>
-        <w:t>notaría</w:t>
-      </w:r>
-      <w:r>
-        <w:rPr>
-          <w:rFonts w:ascii="Arial" w:eastAsia="Times New Roman" w:hAnsi="Arial" w:cs="Arial"/>
-          <w:color w:val="auto"/>
-          <w:sz w:val="22"/>
-          <w:szCs w:val="22"/>
-          <w:lang w:val="es-ES_tradnl" w:bidi="ar-SA"/>
-        </w:rPr>
-        <w:t xml:space="preserve">. - - - - - - - - - - - - - - - - - - - - - - - - - - - - - - - - - A u t o r i z o.- La escritura que antecede en la Ciudad de Tezontepec de Aldama, Estado de Hidalgo, a los </w:t>
+        <w:t xml:space="preserve">12 doce días del mes de </w:t>
       </w:r>
       <w:r>
         <w:rPr>
@@ -8124,7 +8007,7 @@
           <w:szCs w:val="22"/>
           <w:lang w:val="es-ES_tradnl" w:bidi="ar-SA"/>
         </w:rPr>
-        <w:t xml:space="preserve">12 doce días del mes de </w:t>
+        <w:t>s</w:t>
       </w:r>
       <w:r>
         <w:rPr>
@@ -8134,93 +8017,17 @@
           <w:szCs w:val="22"/>
           <w:lang w:val="es-ES_tradnl" w:bidi="ar-SA"/>
         </w:rPr>
-        <w:t>s</w:t>
+        <w:t>eptiembre del año 2024 dos mil veinticuatro</w:t>
       </w:r>
       <w:r>
         <w:rPr>
           <w:rFonts w:ascii="Arial" w:eastAsia="Times New Roman" w:hAnsi="Arial" w:cs="Arial"/>
-          <w:color w:val="4472C4" w:themeColor="accent5"/>
+          <w:color w:val="auto"/>
           <w:sz w:val="22"/>
           <w:szCs w:val="22"/>
           <w:lang w:val="es-ES_tradnl" w:bidi="ar-SA"/>
         </w:rPr>
-        <w:t>eptiembre del año 2024 dos mil veinticuatro</w:t>
-      </w:r>
-      <w:r>
-        <w:rPr>
-          <w:rFonts w:ascii="Arial" w:eastAsia="Times New Roman" w:hAnsi="Arial" w:cs="Arial"/>
-          <w:color w:val="auto"/>
-          <w:sz w:val="22"/>
-          <w:szCs w:val="22"/>
-          <w:lang w:val="es-ES_tradnl" w:bidi="ar-SA"/>
-        </w:rPr>
-        <w:t xml:space="preserve">, fecha en que se efectúo el traslado de dominio </w:t>
-      </w:r>
-      <w:proofErr w:type="gramStart"/>
-      <w:r>
-        <w:rPr>
-          <w:rFonts w:ascii="Arial" w:eastAsia="Times New Roman" w:hAnsi="Arial" w:cs="Arial"/>
-          <w:color w:val="auto"/>
-          <w:sz w:val="22"/>
-          <w:szCs w:val="22"/>
-          <w:lang w:val="es-ES_tradnl" w:bidi="ar-SA"/>
-        </w:rPr>
-        <w:t>correspondiente.-</w:t>
-      </w:r>
-      <w:proofErr w:type="gramEnd"/>
-      <w:r>
-        <w:rPr>
-          <w:rFonts w:ascii="Arial" w:eastAsia="Times New Roman" w:hAnsi="Arial" w:cs="Arial"/>
-          <w:color w:val="auto"/>
-          <w:sz w:val="22"/>
-          <w:szCs w:val="22"/>
-          <w:lang w:val="es-ES_tradnl" w:bidi="ar-SA"/>
-        </w:rPr>
-        <w:t xml:space="preserve"> Doy </w:t>
-      </w:r>
-      <w:proofErr w:type="gramStart"/>
-      <w:r>
-        <w:rPr>
-          <w:rFonts w:ascii="Arial" w:eastAsia="Times New Roman" w:hAnsi="Arial" w:cs="Arial"/>
-          <w:color w:val="auto"/>
-          <w:sz w:val="22"/>
-          <w:szCs w:val="22"/>
-          <w:lang w:val="es-ES_tradnl" w:bidi="ar-SA"/>
-        </w:rPr>
-        <w:t>fe.-</w:t>
-      </w:r>
-      <w:proofErr w:type="gramEnd"/>
-      <w:r>
-        <w:rPr>
-          <w:rFonts w:ascii="Arial" w:eastAsia="Times New Roman" w:hAnsi="Arial" w:cs="Arial"/>
-          <w:color w:val="auto"/>
-          <w:sz w:val="22"/>
-          <w:szCs w:val="22"/>
-          <w:lang w:val="es-ES_tradnl" w:bidi="ar-SA"/>
-        </w:rPr>
-        <w:t xml:space="preserve"> Una firma ilegible del Ciudadano Licenciado Edén Khadaffy Cornejo </w:t>
-      </w:r>
-      <w:proofErr w:type="gramStart"/>
-      <w:r>
-        <w:rPr>
-          <w:rFonts w:ascii="Arial" w:eastAsia="Times New Roman" w:hAnsi="Arial" w:cs="Arial"/>
-          <w:color w:val="auto"/>
-          <w:sz w:val="22"/>
-          <w:szCs w:val="22"/>
-          <w:lang w:val="es-ES_tradnl" w:bidi="ar-SA"/>
-        </w:rPr>
-        <w:t>Gómez.-</w:t>
-      </w:r>
-      <w:proofErr w:type="gramEnd"/>
-      <w:r>
-        <w:rPr>
-          <w:rFonts w:ascii="Arial" w:eastAsia="Times New Roman" w:hAnsi="Arial" w:cs="Arial"/>
-          <w:color w:val="auto"/>
-          <w:sz w:val="22"/>
-          <w:szCs w:val="22"/>
-          <w:lang w:val="es-ES_tradnl" w:bidi="ar-SA"/>
-        </w:rPr>
-        <w:t xml:space="preserve">El sello de autorizar de la </w:t>
+        <w:t xml:space="preserve">, fecha en que se efectúo el traslado de dominio correspondiente.- Doy fe.- Una firma ilegible del Ciudadano Licenciado Edén Khadaffy Cornejo Gómez.-El sello de autorizar de la </w:t>
       </w:r>
       <w:r>
         <w:rPr>
@@ -8366,7 +8173,7 @@
           <w:szCs w:val="22"/>
           <w:lang w:val="es-ES_tradnl" w:bidi="ar-SA"/>
         </w:rPr>
-        <w:t xml:space="preserve">hojas útiles debidamente selladas, cotejadas y firmada de conformidad con lo dispuesto por los artículos 115 ciento quince y 116 ciento dieciséis de la Ley del Notariado </w:t>
+        <w:t xml:space="preserve">hojas útiles debidamente selladas, cotejadas y firmada de conformidad con lo dispuesto </w:t>
       </w:r>
       <w:r>
         <w:rPr>
@@ -8377,7 +8184,7 @@
           <w:lang w:val="es-ES_tradnl" w:bidi="ar-SA"/>
         </w:rPr>
         <w:lastRenderedPageBreak/>
-        <w:t>en vigor.- Doy Fe.- - - - - - - - - - - - - - - - - - - - - - - - - - - - - - - - - - - - - - - - - - - - - -</w:t>
+        <w:t>por los artículos 115 ciento quince y 116 ciento dieciséis de la Ley del Notariado en vigor.- Doy Fe.- - - - - - - - - - - - - - - - - - - - - - - - - - - - - - - - - - - - - - - - - - - - - -</w:t>
       </w:r>
     </w:p>
     <w:p>

</xml_diff>